<commit_message>
feat(OI): Finaliser les supports du 16 septembre et ajouter le jeu du lean
Mettre a jour le dossier formateur et le dossier enquete pour la session
du 16 septembre. Ajouter les nouveaux supports a imprimer : poster Ishikawa
5M, fiche memo stagiaire, pochettes apprenant. Renommer la trame A3 terrain
pour refleter le bon nombre de tirages (3 au lieu de 6).

Archiver les versions v3 defi anti-erreur dans le dossier abandonne.

Ajouter les fiches animateur pour le jeu du Lean Manufacturing (docx + pdf).

Mettre a jour index.html et LISEZ_MOI.txt.

Co-Authored-By: Claude <noreply@anthropic.com>
</commit_message>
<xml_diff>
--- a/OI/TI18_CH_TPFP_Bourges_15-16_Juillet_31-Aout_1-16_Sept/1_A_IMPRIMER_16_septembre/1_Dossier_formateur_16_septembre.docx
+++ b/OI/TI18_CH_TPFP_Bourges_15-16_Juillet_31-Aout_1-16_Sept/1_A_IMPRIMER_16_septembre/1_Dossier_formateur_16_septembre.docx
@@ -126,7 +126,7 @@
           <w:sz w:val="24"/>
           <w:szCs w:val="24"/>
         </w:rPr>
-        <w:t>Réveil Poka-Yoke, 5 Pourquoi, enquête inter-métiers, co-développement, rituel debout</w:t>
+        <w:t>Sept séquences de A à G, une pochette apprenant par séquence</w:t>
       </w:r>
     </w:p>
     <w:p>
@@ -162,7 +162,19 @@
           <w:b w:val="0"/>
           <w:i w:val="0"/>
         </w:rPr>
-        <w:t>Il s'appuie sur le scénario de journée que tu as retenu : réveil Poka-Yoke, 5 Pourquoi guidés, enquête industrielle inter-métiers le reste de la matinée, co-développement sur les problèmes de stage l'après-midi, restitution en rituel debout.</w:t>
+        <w:t>Sept séquences, notées A à G. Recueil des situations de stage, 5 Pourquoi guidés, enquête industrielle inter-métiers le reste de la matinée, puis co-développement sur leurs propres cas et restitution en rituel debout.</w:t>
+      </w:r>
+    </w:p>
+    <w:p>
+      <w:pPr>
+        <w:spacing w:after="120"/>
+      </w:pPr>
+      <w:r>
+        <w:rPr>
+          <w:b w:val="0"/>
+          <w:i w:val="0"/>
+        </w:rPr>
+        <w:t>Chaque séquence a sa pochette apprenant, avec une mise en situation écrite qui pose le problème. Les trois du matin sont indépendantes les unes des autres. Celles de l'après-midi forment un bloc, mais ce bloc ne suppose rien du matin.</w:t>
       </w:r>
     </w:p>
     <w:tbl>
@@ -309,7 +321,7 @@
           <w:b w:val="0"/>
           <w:i w:val="0"/>
         </w:rPr>
-        <w:t>Le découpage du scénario d'origine ne tenait pas : trente minutes pour un Poka-Yoke en deux manches, et deux heures pour une enquête complète sans restitution. Voici le découpage recalé.</w:t>
+        <w:t>Le découpage du scénario d'origine ne tenait pas : deux heures pour une enquête complète, sans restitution. Voici le découpage recalé, vérifié minute par minute : 390 minutes de travail effectif, hors pauses et déjeuner.</w:t>
       </w:r>
     </w:p>
     <w:tbl>
@@ -430,7 +442,7 @@
                 <w:b w:val="0"/>
                 <w:sz w:val="20"/>
               </w:rPr>
-              <w:t>Réveil : le défi anti-erreur</w:t>
+              <w:t>A. Le problème du jour</w:t>
             </w:r>
           </w:p>
         </w:tc>
@@ -448,7 +460,7 @@
                 <w:b w:val="0"/>
                 <w:sz w:val="20"/>
               </w:rPr>
-              <w:t>Deux manches de montage chronométrées. La deuxième avec un détrompeur.</w:t>
+              <w:t>Tour de table, puis recueil des dysfonctionnements de stage sur post-its.</w:t>
             </w:r>
           </w:p>
         </w:tc>
@@ -489,7 +501,7 @@
                 <w:b w:val="0"/>
                 <w:sz w:val="20"/>
               </w:rPr>
-              <w:t>5 Pourquoi guidés au tableau</w:t>
+              <w:t>B. Les 5 Pourquoi guidés</w:t>
             </w:r>
           </w:p>
         </w:tc>
@@ -507,7 +519,7 @@
                 <w:b w:val="0"/>
                 <w:sz w:val="20"/>
               </w:rPr>
-              <w:t>Démonstration collective sur un arrêt de presse plieuse. Toi au tableau, eux qui parlent.</w:t>
+              <w:t>L'arrêt d'une presse plieuse. Démonstration collective au tableau.</w:t>
             </w:r>
           </w:p>
         </w:tc>
@@ -606,7 +618,7 @@
                 <w:b w:val="0"/>
                 <w:sz w:val="20"/>
               </w:rPr>
-              <w:t>Lancement de l'enquête</w:t>
+              <w:t>C. Lancement de l'enquête</w:t>
             </w:r>
           </w:p>
         </w:tc>
@@ -665,7 +677,7 @@
                 <w:b w:val="0"/>
                 <w:sz w:val="20"/>
               </w:rPr>
-              <w:t>Temps 1 : les faits et la chronologie</w:t>
+              <w:t>C. Temps 1 : les faits et la chronologie</w:t>
             </w:r>
           </w:p>
         </w:tc>
@@ -724,7 +736,7 @@
                 <w:b w:val="0"/>
                 <w:sz w:val="20"/>
               </w:rPr>
-              <w:t>Temps 2 : les hypothèses et les demandes d'indices</w:t>
+              <w:t>C. Temps 2 : hypothèses et demandes d'indices</w:t>
             </w:r>
           </w:p>
         </w:tc>
@@ -783,7 +795,7 @@
                 <w:b w:val="0"/>
                 <w:sz w:val="20"/>
               </w:rPr>
-              <w:t>Temps 3 : le tri, est et n'est pas</w:t>
+              <w:t>C. Temps 3 : le tri, est et n'est pas</w:t>
             </w:r>
           </w:p>
         </w:tc>
@@ -842,7 +854,7 @@
                 <w:b w:val="0"/>
                 <w:sz w:val="20"/>
               </w:rPr>
-              <w:t>Temps 4 : restitution des trois cellules</w:t>
+              <w:t>C. Temps 4 : restitution des trois cellules</w:t>
             </w:r>
           </w:p>
         </w:tc>
@@ -901,7 +913,7 @@
                 <w:b w:val="0"/>
                 <w:sz w:val="20"/>
               </w:rPr>
-              <w:t>Révélation et clôture du matin</w:t>
+              <w:t>C. Révélation et clôture du matin</w:t>
             </w:r>
           </w:p>
         </w:tc>
@@ -1000,7 +1012,7 @@
                 <w:b w:val="0"/>
                 <w:sz w:val="20"/>
               </w:rPr>
-              <w:t>13h30 - 13h50</w:t>
+              <w:t>13h30 - 13h45</w:t>
             </w:r>
           </w:p>
         </w:tc>
@@ -1018,7 +1030,7 @@
                 <w:b w:val="0"/>
                 <w:sz w:val="20"/>
               </w:rPr>
-              <w:t>Recueil des problèmes de stage</w:t>
+              <w:t>D. Le choix des trois cas</w:t>
             </w:r>
           </w:p>
         </w:tc>
@@ -1036,7 +1048,7 @@
                 <w:b w:val="0"/>
                 <w:sz w:val="20"/>
               </w:rPr>
-              <w:t>Post-its, regroupement par affinité, vote aux gommettes, trois cas retenus.</w:t>
+              <w:t>Regroupement des post-its du matin, vote aux gommettes, trois cas retenus.</w:t>
             </w:r>
           </w:p>
         </w:tc>
@@ -1059,7 +1071,7 @@
                 <w:b w:val="0"/>
                 <w:sz w:val="20"/>
               </w:rPr>
-              <w:t>13h50 - 14h50</w:t>
+              <w:t>13h45 - 14h50</w:t>
             </w:r>
           </w:p>
         </w:tc>
@@ -1077,7 +1089,7 @@
                 <w:b w:val="0"/>
                 <w:sz w:val="20"/>
               </w:rPr>
-              <w:t>Co-développement en trois cellules</w:t>
+              <w:t>E. Le co-développement</w:t>
             </w:r>
           </w:p>
         </w:tc>
@@ -1194,7 +1206,7 @@
                 <w:b w:val="0"/>
                 <w:sz w:val="20"/>
               </w:rPr>
-              <w:t>Rituel debout, cinq minutes par cellule</w:t>
+              <w:t>F. Le rituel debout</w:t>
             </w:r>
           </w:p>
         </w:tc>
@@ -1212,7 +1224,7 @@
                 <w:b w:val="0"/>
                 <w:sz w:val="20"/>
               </w:rPr>
-              <w:t>Restitution chronométrée, le reste du groupe joue le comité d'amélioration.</w:t>
+              <w:t>Cinq minutes par cellule, chronométrées. Le reste du groupe joue le comité.</w:t>
             </w:r>
           </w:p>
         </w:tc>
@@ -1253,7 +1265,7 @@
                 <w:b w:val="0"/>
                 <w:sz w:val="20"/>
               </w:rPr>
-              <w:t>Débriefing et fiches mémo</w:t>
+              <w:t>G. Débriefing et remise de la fiche mémo</w:t>
             </w:r>
           </w:p>
         </w:tc>
@@ -1271,7 +1283,7 @@
                 <w:b w:val="0"/>
                 <w:sz w:val="20"/>
               </w:rPr>
-              <w:t>Ce qu'ils emportent. Tour de table de clôture.</w:t>
+              <w:t>Les sept réflexes. Chacun écrit le problème qu'il traitera en entreprise.</w:t>
             </w:r>
           </w:p>
         </w:tc>
@@ -1320,7 +1332,7 @@
                 <w:color w:val="2E5A9C"/>
                 <w:sz w:val="21"/>
               </w:rPr>
-              <w:t>Ce qui tient la journée</w:t>
+              <w:t>Chaque séquence tient debout seule</w:t>
             </w:r>
           </w:p>
           <w:p>
@@ -1332,19 +1344,26 @@
                 <w:b w:val="0"/>
                 <w:sz w:val="21"/>
               </w:rPr>
-              <w:t>Le matin, ils apprennent la méthode sur une affaire cadrée dont tu connais la réponse.</w:t>
-            </w:r>
-          </w:p>
-          <w:p>
-            <w:pPr>
-              <w:spacing w:after="40"/>
-            </w:pPr>
-            <w:r>
-              <w:rPr>
-                <w:b w:val="0"/>
+              <w:t>Les trois séquences du matin ont chacune leur propre mise en situation écrite. Aucune ne suppose d'avoir vécu la précédente. Tu peux en sauter une, en déplacer une, ou reprendre l'une d'elles seule dans une autre session.</w:t>
+            </w:r>
+          </w:p>
+          <w:p>
+            <w:pPr>
+              <w:spacing w:after="40"/>
+            </w:pPr>
+            <w:r>
+              <w:rPr>
+                <w:b/>
                 <w:sz w:val="21"/>
               </w:rPr>
-              <w:t>L'après-midi, ils appliquent la même méthode à leurs propres situations, dont tu ne connais pas la réponse. C'est voulu : ta valeur n'est pas de savoir, elle est de faire chercher.</w:t>
+              <w:t xml:space="preserve">L'après-midi est un bloc de trois temps liés. </w:t>
+            </w:r>
+            <w:r>
+              <w:rPr>
+                <w:b w:val="0"/>
+                <w:sz w:val="21"/>
+              </w:rPr>
+              <w:t>Le choix des cas produit la matière du co-développement, qui produit les affiches du rituel debout. On ne peut pas les séparer sans les vider. En revanche, le bloc entier ne suppose rien du matin.</w:t>
             </w:r>
           </w:p>
           <w:p>
@@ -1356,7 +1375,7 @@
                 <w:b w:val="0"/>
                 <w:sz w:val="21"/>
               </w:rPr>
-              <w:t>Le fil unique de la journée tient en une question : qu'est-ce qui a changé, et quand ?</w:t>
+              <w:t>Le fil qui les relie tient en une question, la même partout : qu'est-ce qui a changé, et quand ? Tu peux la poser dans n'importe quel ordre.</w:t>
             </w:r>
           </w:p>
         </w:tc>
@@ -1369,26 +1388,14 @@
     </w:p>
     <w:p>
       <w:pPr>
-        <w:pStyle w:val="Titre1"/>
+        <w:pStyle w:val="Titre2"/>
       </w:pPr>
       <w:r>
         <w:rPr>
           <w:b w:val="0"/>
           <w:i w:val="0"/>
         </w:rPr>
-        <w:t>Séquence 1. Le défi anti-erreur, 08h30 à 09h00</w:t>
-      </w:r>
-    </w:p>
-    <w:p>
-      <w:pPr>
-        <w:pStyle w:val="Titre2"/>
-      </w:pPr>
-      <w:r>
-        <w:rPr>
-          <w:b w:val="0"/>
-          <w:i w:val="0"/>
-        </w:rPr>
-        <w:t>Matériel à réunir toi-même</w:t>
+        <w:t>Ce que reçoit l'apprenant, séquence par séquence</w:t>
       </w:r>
     </w:p>
     <w:tbl>
@@ -1406,9 +1413,9 @@
         <w:tblLayout w:type="fixed"/>
       </w:tblPr>
       <w:tblGrid>
-        <w:gridCol w:w="3742"/>
-        <w:gridCol w:w="1361"/>
-        <w:gridCol w:w="3969"/>
+        <w:gridCol w:w="1928"/>
+        <w:gridCol w:w="4535"/>
+        <w:gridCol w:w="2608"/>
       </w:tblGrid>
       <w:tr>
         <w:trPr>
@@ -1417,7 +1424,7 @@
         </w:trPr>
         <w:tc>
           <w:tcPr>
-            <w:tcW w:type="dxa" w:w="3742"/>
+            <w:tcW w:type="dxa" w:w="1928"/>
             <w:shd w:val="clear" w:color="auto" w:fill="1F3864"/>
           </w:tcPr>
           <w:p>
@@ -1430,13 +1437,13 @@
                 <w:color w:val="FFFFFF"/>
                 <w:sz w:val="20"/>
               </w:rPr>
-              <w:t>Quoi</w:t>
-            </w:r>
-          </w:p>
-        </w:tc>
-        <w:tc>
-          <w:tcPr>
-            <w:tcW w:type="dxa" w:w="1361"/>
+              <w:t>Séquence</w:t>
+            </w:r>
+          </w:p>
+        </w:tc>
+        <w:tc>
+          <w:tcPr>
+            <w:tcW w:type="dxa" w:w="4535"/>
             <w:shd w:val="clear" w:color="auto" w:fill="1F3864"/>
           </w:tcPr>
           <w:p>
@@ -1449,13 +1456,13 @@
                 <w:color w:val="FFFFFF"/>
                 <w:sz w:val="20"/>
               </w:rPr>
-              <w:t>Combien</w:t>
-            </w:r>
-          </w:p>
-        </w:tc>
-        <w:tc>
-          <w:tcPr>
-            <w:tcW w:type="dxa" w:w="3969"/>
+              <w:t>Ce que tu remets au début</w:t>
+            </w:r>
+          </w:p>
+        </w:tc>
+        <w:tc>
+          <w:tcPr>
+            <w:tcW w:type="dxa" w:w="2608"/>
             <w:shd w:val="clear" w:color="auto" w:fill="1F3864"/>
           </w:tcPr>
           <w:p>
@@ -1468,7 +1475,7 @@
                 <w:color w:val="FFFFFF"/>
                 <w:sz w:val="20"/>
               </w:rPr>
-              <w:t>Où le trouver</w:t>
+              <w:t>Ce que tu ramasses à la fin</w:t>
             </w:r>
           </w:p>
         </w:tc>
@@ -1479,55 +1486,55 @@
         </w:trPr>
         <w:tc>
           <w:tcPr>
-            <w:tcW w:type="dxa" w:w="3742"/>
-            <w:shd w:val="clear" w:color="auto" w:fill="FFFFFF"/>
-          </w:tcPr>
-          <w:p>
-            <w:pPr>
-              <w:spacing w:after="40"/>
-            </w:pPr>
-            <w:r>
-              <w:rPr>
-                <w:b w:val="0"/>
-                <w:sz w:val="20"/>
-              </w:rPr>
-              <w:t>Équerres d'assemblage 40 x 40, percées Ø 6</w:t>
-            </w:r>
-          </w:p>
-        </w:tc>
-        <w:tc>
-          <w:tcPr>
-            <w:tcW w:type="dxa" w:w="1361"/>
-            <w:shd w:val="clear" w:color="auto" w:fill="FFFFFF"/>
-          </w:tcPr>
-          <w:p>
-            <w:pPr>
-              <w:spacing w:after="40"/>
-            </w:pPr>
-            <w:r>
-              <w:rPr>
-                <w:b w:val="0"/>
-                <w:sz w:val="20"/>
-              </w:rPr>
-              <w:t>16</w:t>
-            </w:r>
-          </w:p>
-        </w:tc>
-        <w:tc>
-          <w:tcPr>
-            <w:tcW w:type="dxa" w:w="3969"/>
-            <w:shd w:val="clear" w:color="auto" w:fill="FFFFFF"/>
-          </w:tcPr>
-          <w:p>
-            <w:pPr>
-              <w:spacing w:after="40"/>
-            </w:pPr>
-            <w:r>
-              <w:rPr>
-                <w:b w:val="0"/>
-                <w:sz w:val="20"/>
-              </w:rPr>
-              <w:t>Quincaillerie ou magasin du CFAI</w:t>
+            <w:tcW w:type="dxa" w:w="1928"/>
+            <w:shd w:val="clear" w:color="auto" w:fill="FFFFFF"/>
+          </w:tcPr>
+          <w:p>
+            <w:pPr>
+              <w:spacing w:after="40"/>
+            </w:pPr>
+            <w:r>
+              <w:rPr>
+                <w:b w:val="0"/>
+                <w:sz w:val="20"/>
+              </w:rPr>
+              <w:t>A. Le problème du jour</w:t>
+            </w:r>
+          </w:p>
+        </w:tc>
+        <w:tc>
+          <w:tcPr>
+            <w:tcW w:type="dxa" w:w="4535"/>
+            <w:shd w:val="clear" w:color="auto" w:fill="FFFFFF"/>
+          </w:tcPr>
+          <w:p>
+            <w:pPr>
+              <w:spacing w:after="40"/>
+            </w:pPr>
+            <w:r>
+              <w:rPr>
+                <w:b w:val="0"/>
+                <w:sz w:val="20"/>
+              </w:rPr>
+              <w:t>Fiche A, page 2 des pochettes</w:t>
+            </w:r>
+          </w:p>
+        </w:tc>
+        <w:tc>
+          <w:tcPr>
+            <w:tcW w:type="dxa" w:w="2608"/>
+            <w:shd w:val="clear" w:color="auto" w:fill="FFFFFF"/>
+          </w:tcPr>
+          <w:p>
+            <w:pPr>
+              <w:spacing w:after="40"/>
+            </w:pPr>
+            <w:r>
+              <w:rPr>
+                <w:b w:val="0"/>
+                <w:sz w:val="20"/>
+              </w:rPr>
+              <w:t>La fiche A</w:t>
             </w:r>
           </w:p>
         </w:tc>
@@ -1538,55 +1545,55 @@
         </w:trPr>
         <w:tc>
           <w:tcPr>
-            <w:tcW w:type="dxa" w:w="3742"/>
-            <w:shd w:val="clear" w:color="auto" w:fill="F5F5F5"/>
-          </w:tcPr>
-          <w:p>
-            <w:pPr>
-              <w:spacing w:after="40"/>
-            </w:pPr>
-            <w:r>
-              <w:rPr>
-                <w:b w:val="0"/>
-                <w:sz w:val="20"/>
-              </w:rPr>
-              <w:t>Vis M6 x 20, tête identique</w:t>
-            </w:r>
-          </w:p>
-        </w:tc>
-        <w:tc>
-          <w:tcPr>
-            <w:tcW w:type="dxa" w:w="1361"/>
-            <w:shd w:val="clear" w:color="auto" w:fill="F5F5F5"/>
-          </w:tcPr>
-          <w:p>
-            <w:pPr>
-              <w:spacing w:after="40"/>
-            </w:pPr>
-            <w:r>
-              <w:rPr>
-                <w:b w:val="0"/>
-                <w:sz w:val="20"/>
-              </w:rPr>
-              <w:t>24</w:t>
-            </w:r>
-          </w:p>
-        </w:tc>
-        <w:tc>
-          <w:tcPr>
-            <w:tcW w:type="dxa" w:w="3969"/>
-            <w:shd w:val="clear" w:color="auto" w:fill="F5F5F5"/>
-          </w:tcPr>
-          <w:p>
-            <w:pPr>
-              <w:spacing w:after="40"/>
-            </w:pPr>
-            <w:r>
-              <w:rPr>
-                <w:b w:val="0"/>
-                <w:sz w:val="20"/>
-              </w:rPr>
-              <w:t>Idem</w:t>
+            <w:tcW w:type="dxa" w:w="1928"/>
+            <w:shd w:val="clear" w:color="auto" w:fill="F5F5F5"/>
+          </w:tcPr>
+          <w:p>
+            <w:pPr>
+              <w:spacing w:after="40"/>
+            </w:pPr>
+            <w:r>
+              <w:rPr>
+                <w:b w:val="0"/>
+                <w:sz w:val="20"/>
+              </w:rPr>
+              <w:t>B. Les 5 Pourquoi</w:t>
+            </w:r>
+          </w:p>
+        </w:tc>
+        <w:tc>
+          <w:tcPr>
+            <w:tcW w:type="dxa" w:w="4535"/>
+            <w:shd w:val="clear" w:color="auto" w:fill="F5F5F5"/>
+          </w:tcPr>
+          <w:p>
+            <w:pPr>
+              <w:spacing w:after="40"/>
+            </w:pPr>
+            <w:r>
+              <w:rPr>
+                <w:b w:val="0"/>
+                <w:sz w:val="20"/>
+              </w:rPr>
+              <w:t>Fiches B, pages 3 et 4 des pochettes</w:t>
+            </w:r>
+          </w:p>
+        </w:tc>
+        <w:tc>
+          <w:tcPr>
+            <w:tcW w:type="dxa" w:w="2608"/>
+            <w:shd w:val="clear" w:color="auto" w:fill="F5F5F5"/>
+          </w:tcPr>
+          <w:p>
+            <w:pPr>
+              <w:spacing w:after="40"/>
+            </w:pPr>
+            <w:r>
+              <w:rPr>
+                <w:b w:val="0"/>
+                <w:sz w:val="20"/>
+              </w:rPr>
+              <w:t>Rien, ils gardent</w:t>
             </w:r>
           </w:p>
         </w:tc>
@@ -1597,55 +1604,55 @@
         </w:trPr>
         <w:tc>
           <w:tcPr>
-            <w:tcW w:type="dxa" w:w="3742"/>
-            <w:shd w:val="clear" w:color="auto" w:fill="FFFFFF"/>
-          </w:tcPr>
-          <w:p>
-            <w:pPr>
-              <w:spacing w:after="40"/>
-            </w:pPr>
-            <w:r>
-              <w:rPr>
-                <w:b w:val="0"/>
-                <w:sz w:val="20"/>
-              </w:rPr>
-              <w:t>Vis M6 x 25, tête identique</w:t>
-            </w:r>
-          </w:p>
-        </w:tc>
-        <w:tc>
-          <w:tcPr>
-            <w:tcW w:type="dxa" w:w="1361"/>
-            <w:shd w:val="clear" w:color="auto" w:fill="FFFFFF"/>
-          </w:tcPr>
-          <w:p>
-            <w:pPr>
-              <w:spacing w:after="40"/>
-            </w:pPr>
-            <w:r>
-              <w:rPr>
-                <w:b w:val="0"/>
-                <w:sz w:val="20"/>
-              </w:rPr>
-              <w:t>12</w:t>
-            </w:r>
-          </w:p>
-        </w:tc>
-        <w:tc>
-          <w:tcPr>
-            <w:tcW w:type="dxa" w:w="3969"/>
-            <w:shd w:val="clear" w:color="auto" w:fill="FFFFFF"/>
-          </w:tcPr>
-          <w:p>
-            <w:pPr>
-              <w:spacing w:after="40"/>
-            </w:pPr>
-            <w:r>
-              <w:rPr>
-                <w:b w:val="0"/>
-                <w:sz w:val="20"/>
-              </w:rPr>
-              <w:t>Idem</w:t>
+            <w:tcW w:type="dxa" w:w="1928"/>
+            <w:shd w:val="clear" w:color="auto" w:fill="FFFFFF"/>
+          </w:tcPr>
+          <w:p>
+            <w:pPr>
+              <w:spacing w:after="40"/>
+            </w:pPr>
+            <w:r>
+              <w:rPr>
+                <w:b w:val="0"/>
+                <w:sz w:val="20"/>
+              </w:rPr>
+              <w:t>C. L'enquête</w:t>
+            </w:r>
+          </w:p>
+        </w:tc>
+        <w:tc>
+          <w:tcPr>
+            <w:tcW w:type="dxa" w:w="4535"/>
+            <w:shd w:val="clear" w:color="auto" w:fill="FFFFFF"/>
+          </w:tcPr>
+          <w:p>
+            <w:pPr>
+              <w:spacing w:after="40"/>
+            </w:pPr>
+            <w:r>
+              <w:rPr>
+                <w:b w:val="0"/>
+                <w:sz w:val="20"/>
+              </w:rPr>
+              <w:t>Dossier de départ P1 à P4, poster Ishikawa, trame A3. Les pièces P5 à P18 restent chez toi</w:t>
+            </w:r>
+          </w:p>
+        </w:tc>
+        <w:tc>
+          <w:tcPr>
+            <w:tcW w:type="dxa" w:w="2608"/>
+            <w:shd w:val="clear" w:color="auto" w:fill="FFFFFF"/>
+          </w:tcPr>
+          <w:p>
+            <w:pPr>
+              <w:spacing w:after="40"/>
+            </w:pPr>
+            <w:r>
+              <w:rPr>
+                <w:b w:val="0"/>
+                <w:sz w:val="20"/>
+              </w:rPr>
+              <w:t>Tout, dossier et pièces remises</w:t>
             </w:r>
           </w:p>
         </w:tc>
@@ -1656,55 +1663,55 @@
         </w:trPr>
         <w:tc>
           <w:tcPr>
-            <w:tcW w:type="dxa" w:w="3742"/>
-            <w:shd w:val="clear" w:color="auto" w:fill="F5F5F5"/>
-          </w:tcPr>
-          <w:p>
-            <w:pPr>
-              <w:spacing w:after="40"/>
-            </w:pPr>
-            <w:r>
-              <w:rPr>
-                <w:b w:val="0"/>
-                <w:sz w:val="20"/>
-              </w:rPr>
-              <w:t>Écrous M6 et rondelles</w:t>
-            </w:r>
-          </w:p>
-        </w:tc>
-        <w:tc>
-          <w:tcPr>
-            <w:tcW w:type="dxa" w:w="1361"/>
-            <w:shd w:val="clear" w:color="auto" w:fill="F5F5F5"/>
-          </w:tcPr>
-          <w:p>
-            <w:pPr>
-              <w:spacing w:after="40"/>
-            </w:pPr>
-            <w:r>
-              <w:rPr>
-                <w:b w:val="0"/>
-                <w:sz w:val="20"/>
-              </w:rPr>
-              <w:t>40</w:t>
-            </w:r>
-          </w:p>
-        </w:tc>
-        <w:tc>
-          <w:tcPr>
-            <w:tcW w:type="dxa" w:w="3969"/>
-            <w:shd w:val="clear" w:color="auto" w:fill="F5F5F5"/>
-          </w:tcPr>
-          <w:p>
-            <w:pPr>
-              <w:spacing w:after="40"/>
-            </w:pPr>
-            <w:r>
-              <w:rPr>
-                <w:b w:val="0"/>
-                <w:sz w:val="20"/>
-              </w:rPr>
-              <w:t>Idem</w:t>
+            <w:tcW w:type="dxa" w:w="1928"/>
+            <w:shd w:val="clear" w:color="auto" w:fill="F5F5F5"/>
+          </w:tcPr>
+          <w:p>
+            <w:pPr>
+              <w:spacing w:after="40"/>
+            </w:pPr>
+            <w:r>
+              <w:rPr>
+                <w:b w:val="0"/>
+                <w:sz w:val="20"/>
+              </w:rPr>
+              <w:t>D. Le choix des cas</w:t>
+            </w:r>
+          </w:p>
+        </w:tc>
+        <w:tc>
+          <w:tcPr>
+            <w:tcW w:type="dxa" w:w="4535"/>
+            <w:shd w:val="clear" w:color="auto" w:fill="F5F5F5"/>
+          </w:tcPr>
+          <w:p>
+            <w:pPr>
+              <w:spacing w:after="40"/>
+            </w:pPr>
+            <w:r>
+              <w:rPr>
+                <w:b w:val="0"/>
+                <w:sz w:val="20"/>
+              </w:rPr>
+              <w:t>Fiche D, page 5 des pochettes</w:t>
+            </w:r>
+          </w:p>
+        </w:tc>
+        <w:tc>
+          <w:tcPr>
+            <w:tcW w:type="dxa" w:w="2608"/>
+            <w:shd w:val="clear" w:color="auto" w:fill="F5F5F5"/>
+          </w:tcPr>
+          <w:p>
+            <w:pPr>
+              <w:spacing w:after="40"/>
+            </w:pPr>
+            <w:r>
+              <w:rPr>
+                <w:b w:val="0"/>
+                <w:sz w:val="20"/>
+              </w:rPr>
+              <w:t>La fiche D</w:t>
             </w:r>
           </w:p>
         </w:tc>
@@ -1715,55 +1722,55 @@
         </w:trPr>
         <w:tc>
           <w:tcPr>
-            <w:tcW w:type="dxa" w:w="3742"/>
-            <w:shd w:val="clear" w:color="auto" w:fill="FFFFFF"/>
-          </w:tcPr>
-          <w:p>
-            <w:pPr>
-              <w:spacing w:after="40"/>
-            </w:pPr>
-            <w:r>
-              <w:rPr>
-                <w:b w:val="0"/>
-                <w:sz w:val="20"/>
-              </w:rPr>
-              <w:t>Tasseaux ou profilés de 300 mm</w:t>
-            </w:r>
-          </w:p>
-        </w:tc>
-        <w:tc>
-          <w:tcPr>
-            <w:tcW w:type="dxa" w:w="1361"/>
-            <w:shd w:val="clear" w:color="auto" w:fill="FFFFFF"/>
-          </w:tcPr>
-          <w:p>
-            <w:pPr>
-              <w:spacing w:after="40"/>
-            </w:pPr>
-            <w:r>
-              <w:rPr>
-                <w:b w:val="0"/>
-                <w:sz w:val="20"/>
-              </w:rPr>
-              <w:t>8</w:t>
-            </w:r>
-          </w:p>
-        </w:tc>
-        <w:tc>
-          <w:tcPr>
-            <w:tcW w:type="dxa" w:w="3969"/>
-            <w:shd w:val="clear" w:color="auto" w:fill="FFFFFF"/>
-          </w:tcPr>
-          <w:p>
-            <w:pPr>
-              <w:spacing w:after="40"/>
-            </w:pPr>
-            <w:r>
-              <w:rPr>
-                <w:b w:val="0"/>
-                <w:sz w:val="20"/>
-              </w:rPr>
-              <w:t>Chutes de l'atelier bois ou métal</w:t>
+            <w:tcW w:type="dxa" w:w="1928"/>
+            <w:shd w:val="clear" w:color="auto" w:fill="FFFFFF"/>
+          </w:tcPr>
+          <w:p>
+            <w:pPr>
+              <w:spacing w:after="40"/>
+            </w:pPr>
+            <w:r>
+              <w:rPr>
+                <w:b w:val="0"/>
+                <w:sz w:val="20"/>
+              </w:rPr>
+              <w:t>E. Le co-développement</w:t>
+            </w:r>
+          </w:p>
+        </w:tc>
+        <w:tc>
+          <w:tcPr>
+            <w:tcW w:type="dxa" w:w="4535"/>
+            <w:shd w:val="clear" w:color="auto" w:fill="FFFFFF"/>
+          </w:tcPr>
+          <w:p>
+            <w:pPr>
+              <w:spacing w:after="40"/>
+            </w:pPr>
+            <w:r>
+              <w:rPr>
+                <w:b w:val="0"/>
+                <w:sz w:val="20"/>
+              </w:rPr>
+              <w:t>Fiche E page 6, trame A3, poster Ishikawa</w:t>
+            </w:r>
+          </w:p>
+        </w:tc>
+        <w:tc>
+          <w:tcPr>
+            <w:tcW w:type="dxa" w:w="2608"/>
+            <w:shd w:val="clear" w:color="auto" w:fill="FFFFFF"/>
+          </w:tcPr>
+          <w:p>
+            <w:pPr>
+              <w:spacing w:after="40"/>
+            </w:pPr>
+            <w:r>
+              <w:rPr>
+                <w:b w:val="0"/>
+                <w:sz w:val="20"/>
+              </w:rPr>
+              <w:t>Rien, l'affiche sert à 15h05</w:t>
             </w:r>
           </w:p>
         </w:tc>
@@ -1774,55 +1781,55 @@
         </w:trPr>
         <w:tc>
           <w:tcPr>
-            <w:tcW w:type="dxa" w:w="3742"/>
-            <w:shd w:val="clear" w:color="auto" w:fill="F5F5F5"/>
-          </w:tcPr>
-          <w:p>
-            <w:pPr>
-              <w:spacing w:after="40"/>
-            </w:pPr>
-            <w:r>
-              <w:rPr>
-                <w:b w:val="0"/>
-                <w:sz w:val="20"/>
-              </w:rPr>
-              <w:t>Boîte à compartiments, 6 cases</w:t>
-            </w:r>
-          </w:p>
-        </w:tc>
-        <w:tc>
-          <w:tcPr>
-            <w:tcW w:type="dxa" w:w="1361"/>
-            <w:shd w:val="clear" w:color="auto" w:fill="F5F5F5"/>
-          </w:tcPr>
-          <w:p>
-            <w:pPr>
-              <w:spacing w:after="40"/>
-            </w:pPr>
-            <w:r>
-              <w:rPr>
-                <w:b w:val="0"/>
-                <w:sz w:val="20"/>
-              </w:rPr>
-              <w:t>4</w:t>
-            </w:r>
-          </w:p>
-        </w:tc>
-        <w:tc>
-          <w:tcPr>
-            <w:tcW w:type="dxa" w:w="3969"/>
-            <w:shd w:val="clear" w:color="auto" w:fill="F5F5F5"/>
-          </w:tcPr>
-          <w:p>
-            <w:pPr>
-              <w:spacing w:after="40"/>
-            </w:pPr>
-            <w:r>
-              <w:rPr>
-                <w:b w:val="0"/>
-                <w:sz w:val="20"/>
-              </w:rPr>
-              <w:t>Quincaillerie</w:t>
+            <w:tcW w:type="dxa" w:w="1928"/>
+            <w:shd w:val="clear" w:color="auto" w:fill="F5F5F5"/>
+          </w:tcPr>
+          <w:p>
+            <w:pPr>
+              <w:spacing w:after="40"/>
+            </w:pPr>
+            <w:r>
+              <w:rPr>
+                <w:b w:val="0"/>
+                <w:sz w:val="20"/>
+              </w:rPr>
+              <w:t>F. Le rituel debout</w:t>
+            </w:r>
+          </w:p>
+        </w:tc>
+        <w:tc>
+          <w:tcPr>
+            <w:tcW w:type="dxa" w:w="4535"/>
+            <w:shd w:val="clear" w:color="auto" w:fill="F5F5F5"/>
+          </w:tcPr>
+          <w:p>
+            <w:pPr>
+              <w:spacing w:after="40"/>
+            </w:pPr>
+            <w:r>
+              <w:rPr>
+                <w:b w:val="0"/>
+                <w:sz w:val="20"/>
+              </w:rPr>
+              <w:t>Fiche F page 7, plus une carte du comité par personne</w:t>
+            </w:r>
+          </w:p>
+        </w:tc>
+        <w:tc>
+          <w:tcPr>
+            <w:tcW w:type="dxa" w:w="2608"/>
+            <w:shd w:val="clear" w:color="auto" w:fill="F5F5F5"/>
+          </w:tcPr>
+          <w:p>
+            <w:pPr>
+              <w:spacing w:after="40"/>
+            </w:pPr>
+            <w:r>
+              <w:rPr>
+                <w:b w:val="0"/>
+                <w:sz w:val="20"/>
+              </w:rPr>
+              <w:t>Les cartes</w:t>
             </w:r>
           </w:p>
         </w:tc>
@@ -1833,55 +1840,55 @@
         </w:trPr>
         <w:tc>
           <w:tcPr>
-            <w:tcW w:type="dxa" w:w="3742"/>
-            <w:shd w:val="clear" w:color="auto" w:fill="FFFFFF"/>
-          </w:tcPr>
-          <w:p>
-            <w:pPr>
-              <w:spacing w:after="40"/>
-            </w:pPr>
-            <w:r>
-              <w:rPr>
-                <w:b w:val="0"/>
-                <w:sz w:val="20"/>
-              </w:rPr>
-              <w:t>Marqueur peinture rouge</w:t>
-            </w:r>
-          </w:p>
-        </w:tc>
-        <w:tc>
-          <w:tcPr>
-            <w:tcW w:type="dxa" w:w="1361"/>
-            <w:shd w:val="clear" w:color="auto" w:fill="FFFFFF"/>
-          </w:tcPr>
-          <w:p>
-            <w:pPr>
-              <w:spacing w:after="40"/>
-            </w:pPr>
-            <w:r>
-              <w:rPr>
-                <w:b w:val="0"/>
-                <w:sz w:val="20"/>
-              </w:rPr>
-              <w:t>1</w:t>
-            </w:r>
-          </w:p>
-        </w:tc>
-        <w:tc>
-          <w:tcPr>
-            <w:tcW w:type="dxa" w:w="3969"/>
-            <w:shd w:val="clear" w:color="auto" w:fill="FFFFFF"/>
-          </w:tcPr>
-          <w:p>
-            <w:pPr>
-              <w:spacing w:after="40"/>
-            </w:pPr>
-            <w:r>
-              <w:rPr>
-                <w:b w:val="0"/>
-                <w:sz w:val="20"/>
-              </w:rPr>
-              <w:t>Pour la deuxième manche</w:t>
+            <w:tcW w:type="dxa" w:w="1928"/>
+            <w:shd w:val="clear" w:color="auto" w:fill="FFFFFF"/>
+          </w:tcPr>
+          <w:p>
+            <w:pPr>
+              <w:spacing w:after="40"/>
+            </w:pPr>
+            <w:r>
+              <w:rPr>
+                <w:b w:val="0"/>
+                <w:sz w:val="20"/>
+              </w:rPr>
+              <w:t>G. Débriefing</w:t>
+            </w:r>
+          </w:p>
+        </w:tc>
+        <w:tc>
+          <w:tcPr>
+            <w:tcW w:type="dxa" w:w="4535"/>
+            <w:shd w:val="clear" w:color="auto" w:fill="FFFFFF"/>
+          </w:tcPr>
+          <w:p>
+            <w:pPr>
+              <w:spacing w:after="40"/>
+            </w:pPr>
+            <w:r>
+              <w:rPr>
+                <w:b w:val="0"/>
+                <w:sz w:val="20"/>
+              </w:rPr>
+              <w:t>Fiche mémo, page 1</w:t>
+            </w:r>
+          </w:p>
+        </w:tc>
+        <w:tc>
+          <w:tcPr>
+            <w:tcW w:type="dxa" w:w="2608"/>
+            <w:shd w:val="clear" w:color="auto" w:fill="FFFFFF"/>
+          </w:tcPr>
+          <w:p>
+            <w:pPr>
+              <w:spacing w:after="40"/>
+            </w:pPr>
+            <w:r>
+              <w:rPr>
+                <w:b w:val="0"/>
+                <w:sz w:val="20"/>
+              </w:rPr>
+              <w:t>Rien, ils l'emportent</w:t>
             </w:r>
           </w:p>
         </w:tc>
@@ -1894,214 +1901,26 @@
     </w:p>
     <w:p>
       <w:pPr>
-        <w:spacing w:after="120"/>
+        <w:pStyle w:val="Titre1"/>
       </w:pPr>
       <w:r>
         <w:rPr>
           <w:b w:val="0"/>
           <w:i w:val="0"/>
         </w:rPr>
-        <w:t>Compte une heure de préparation la veille. Rien n'est à usiner.</w:t>
+        <w:t>Séquence A. Le problème du jour, 08h30 à 09h00</w:t>
       </w:r>
     </w:p>
     <w:p>
       <w:pPr>
-        <w:pStyle w:val="Titre2"/>
+        <w:spacing w:after="120"/>
       </w:pPr>
       <w:r>
         <w:rPr>
           <w:b w:val="0"/>
           <w:i w:val="0"/>
         </w:rPr>
-        <w:t>Manche 1, sous consigne écrite, 3 minutes</w:t>
-      </w:r>
-    </w:p>
-    <w:p>
-      <w:pPr>
-        <w:pStyle w:val="Paragraphedeliste"/>
-        <w:spacing w:after="80"/>
-        <w:numPr>
-          <w:ilvl w:val="0"/>
-          <w:numId w:val="3"/>
-        </w:numPr>
-      </w:pPr>
-      <w:r>
-        <w:t>Quatre binômes. Chacun reçoit un sachet contenant tout le matériel en vrac, et une consigne écrite d'une demi-page.</w:t>
-      </w:r>
-    </w:p>
-    <w:p>
-      <w:pPr>
-        <w:pStyle w:val="Paragraphedeliste"/>
-        <w:spacing w:after="80"/>
-        <w:numPr>
-          <w:ilvl w:val="0"/>
-          <w:numId w:val="3"/>
-        </w:numPr>
-      </w:pPr>
-      <w:r>
-        <w:t>La consigne précise : vis M6 x 25 sur la traverse, vis M6 x 20 sur le montant, équerres orientées perçage double vers le haut.</w:t>
-      </w:r>
-    </w:p>
-    <w:p>
-      <w:pPr>
-        <w:pStyle w:val="Paragraphedeliste"/>
-        <w:spacing w:after="80"/>
-        <w:numPr>
-          <w:ilvl w:val="0"/>
-          <w:numId w:val="3"/>
-        </w:numPr>
-      </w:pPr>
-      <w:r>
-        <w:t>Chrono trois minutes. Tu ne commentes pas, tu observes.</w:t>
-      </w:r>
-    </w:p>
-    <w:tbl>
-      <w:tblPr>
-        <w:tblW w:type="auto" w:w="0"/>
-        <w:tblLook w:firstColumn="1" w:firstRow="1" w:lastColumn="0" w:lastRow="0" w:noHBand="0" w:noVBand="1" w:val="04A0"/>
-        <w:tblBorders>
-          <w:top w:val="single" w:sz="2" w:space="0" w:color="B45F06"/>
-          <w:left w:val="single" w:sz="18" w:space="0" w:color="B45F06"/>
-          <w:bottom w:val="single" w:sz="2" w:space="0" w:color="B45F06"/>
-          <w:right w:val="single" w:sz="2" w:space="0" w:color="B45F06"/>
-          <w:insideH w:val="none" w:sz="0" w:space="0" w:color="FFFFFF"/>
-          <w:insideV w:val="none" w:sz="0" w:space="0" w:color="FFFFFF"/>
-        </w:tblBorders>
-      </w:tblPr>
-      <w:tblGrid>
-        <w:gridCol w:w="9706"/>
-      </w:tblGrid>
-      <w:tr>
-        <w:tc>
-          <w:tcPr>
-            <w:tcW w:type="dxa" w:w="9706"/>
-            <w:shd w:val="clear" w:color="auto" w:fill="FDF2E9"/>
-            <w:tcMar>
-              <w:top w:w="140" w:type="dxa"/>
-              <w:left w:w="180" w:type="dxa"/>
-              <w:bottom w:w="140" w:type="dxa"/>
-              <w:right w:w="180" w:type="dxa"/>
-            </w:tcMar>
-          </w:tcPr>
-          <w:p>
-            <w:pPr>
-              <w:spacing w:after="80"/>
-            </w:pPr>
-            <w:r>
-              <w:rPr>
-                <w:b/>
-                <w:color w:val="B45F06"/>
-                <w:sz w:val="21"/>
-              </w:rPr>
-              <w:t>Ce que tu vas voir, et qu'il ne faut pas empêcher</w:t>
-            </w:r>
-          </w:p>
-          <w:p>
-            <w:pPr>
-              <w:spacing w:after="40"/>
-            </w:pPr>
-            <w:r>
-              <w:rPr>
-                <w:b w:val="0"/>
-                <w:sz w:val="21"/>
-              </w:rPr>
-              <w:t>Des vis longues montées à la place des courtes. Les deux longueurs se ressemblent, et sous chrono personne ne mesure.</w:t>
-            </w:r>
-          </w:p>
-          <w:p>
-            <w:pPr>
-              <w:spacing w:after="40"/>
-            </w:pPr>
-            <w:r>
-              <w:rPr>
-                <w:b w:val="0"/>
-                <w:sz w:val="21"/>
-              </w:rPr>
-              <w:t>Des équerres retournées.</w:t>
-            </w:r>
-          </w:p>
-          <w:p>
-            <w:pPr>
-              <w:spacing w:after="0"/>
-            </w:pPr>
-            <w:r>
-              <w:rPr>
-                <w:b w:val="0"/>
-                <w:sz w:val="21"/>
-              </w:rPr>
-              <w:t>Des pièces qui restent au fond du sachet sans que personne ne s'en aperçoive.</w:t>
-            </w:r>
-          </w:p>
-        </w:tc>
-      </w:tr>
-    </w:tbl>
-    <w:p>
-      <w:pPr>
-        <w:spacing w:after="120"/>
-      </w:pPr>
-    </w:p>
-    <w:p>
-      <w:pPr>
-        <w:pStyle w:val="Titre2"/>
-      </w:pPr>
-      <w:r>
-        <w:rPr>
-          <w:b w:val="0"/>
-          <w:i w:val="0"/>
-        </w:rPr>
-        <w:t>Manche 2, avec détrompeur, 3 minutes</w:t>
-      </w:r>
-    </w:p>
-    <w:p>
-      <w:pPr>
-        <w:pStyle w:val="Paragraphedeliste"/>
-        <w:spacing w:after="80"/>
-        <w:numPr>
-          <w:ilvl w:val="0"/>
-          <w:numId w:val="4"/>
-        </w:numPr>
-      </w:pPr>
-      <w:r>
-        <w:t>Tu reprends tout. Tu redistribues le même travail avec deux dispositifs.</w:t>
-      </w:r>
-    </w:p>
-    <w:p>
-      <w:pPr>
-        <w:pStyle w:val="Paragraphedeliste"/>
-        <w:spacing w:after="80"/>
-        <w:numPr>
-          <w:ilvl w:val="0"/>
-          <w:numId w:val="4"/>
-        </w:numPr>
-      </w:pPr>
-      <w:r>
-        <w:t>Kitting : chaque compartiment de la boîte contient exactement le nombre de pièces nécessaires à une étape. Une pièce qui reste à la fin signale une omission.</w:t>
-      </w:r>
-    </w:p>
-    <w:p>
-      <w:pPr>
-        <w:pStyle w:val="Paragraphedeliste"/>
-        <w:spacing w:after="80"/>
-        <w:numPr>
-          <w:ilvl w:val="0"/>
-          <w:numId w:val="4"/>
-        </w:numPr>
-      </w:pPr>
-      <w:r>
-        <w:t>Repérage visuel : les têtes des vis M6 x 25 sont marquées en rouge. La consigne devient « rouge sur la traverse ».</w:t>
-      </w:r>
-    </w:p>
-    <w:p>
-      <w:pPr>
-        <w:pStyle w:val="Paragraphedeliste"/>
-        <w:spacing w:after="80"/>
-        <w:numPr>
-          <w:ilvl w:val="0"/>
-          <w:numId w:val="4"/>
-        </w:numPr>
-      </w:pPr>
-      <w:r>
-        <w:t>Même chrono. Compare les temps et les erreurs au tableau.</w:t>
+        <w:t>Aucun matériel. Un paperboard, des post-its de trois couleurs, un marqueur.</w:t>
       </w:r>
     </w:p>
     <w:tbl>
@@ -2142,7 +1961,7 @@
                 <w:color w:val="2E5A9C"/>
                 <w:sz w:val="21"/>
               </w:rPr>
-              <w:t>Le débat de dix minutes qui suit, et qui est le vrai contenu</w:t>
+              <w:t>Ce que fait cette séquence</w:t>
             </w:r>
           </w:p>
           <w:p>
@@ -2154,50 +1973,31 @@
                 <w:b w:val="0"/>
                 <w:sz w:val="21"/>
               </w:rPr>
-              <w:t>Question 1 : qu'est-ce qui a supprimé l'erreur ? La consigne était identique dans les deux manches. Ce n'est donc ni l'attention ni la bonne volonté.</w:t>
-            </w:r>
-          </w:p>
-          <w:p>
-            <w:pPr>
-              <w:spacing w:after="40"/>
-            </w:pPr>
-            <w:r>
-              <w:rPr>
-                <w:b/>
+              <w:t>Elle ouvre la journée sur eux, pas sur toi.</w:t>
+            </w:r>
+          </w:p>
+          <w:p>
+            <w:pPr>
+              <w:spacing w:after="40"/>
+            </w:pPr>
+            <w:r>
+              <w:rPr>
+                <w:b w:val="0"/>
                 <w:sz w:val="21"/>
               </w:rPr>
-              <w:t xml:space="preserve">Question 2, à leur poser franchement : ce qu'on vient de faire n'est pas un vrai Poka-Yoke. </w:t>
-            </w:r>
+              <w:t>Elle produit la matière de l'après-midi : les cas de stage sont recueillis maintenant, pas à 13h30. Tu gagnes du temps après le déjeuner, quand le groupe est lourd.</w:t>
+            </w:r>
+          </w:p>
+          <w:p>
+            <w:pPr>
+              <w:spacing w:after="0"/>
+            </w:pPr>
             <w:r>
               <w:rPr>
                 <w:b w:val="0"/>
                 <w:sz w:val="21"/>
               </w:rPr>
-              <w:t>Le marquage rouge et le kitting détectent l'erreur, ils ne l'empêchent pas physiquement. Que faudrait-il pour qu'il soit mécaniquement impossible de se tromper ?</w:t>
-            </w:r>
-          </w:p>
-          <w:p>
-            <w:pPr>
-              <w:spacing w:after="40"/>
-            </w:pPr>
-            <w:r>
-              <w:rPr>
-                <w:b w:val="0"/>
-                <w:sz w:val="21"/>
-              </w:rPr>
-              <w:t>Laisse-les répondre. Ils vont proposer un perçage décalé, un ergot, une longueur telle que la vis courte ne prend pas dans l'écrou. Ce sont eux les techniciens, c'est le moment de le leur dire.</w:t>
-            </w:r>
-          </w:p>
-          <w:p>
-            <w:pPr>
-              <w:spacing w:after="0"/>
-            </w:pPr>
-            <w:r>
-              <w:rPr>
-                <w:b w:val="0"/>
-                <w:sz w:val="21"/>
-              </w:rPr>
-              <w:t>Question 3 : dans votre entreprise de stage, citez un endroit où un détrompeur physique existe, et un endroit où il manque.</w:t>
+              <w:t>Elle ne suppose rien. Un stagiaire qui arrive à 8h45 rattrape en deux phrases.</w:t>
             </w:r>
           </w:p>
         </w:tc>
@@ -2210,27 +2010,398 @@
     </w:p>
     <w:p>
       <w:pPr>
-        <w:pStyle w:val="Titre1"/>
+        <w:pStyle w:val="Titre2"/>
       </w:pPr>
       <w:r>
         <w:rPr>
           <w:b w:val="0"/>
           <w:i w:val="0"/>
         </w:rPr>
-        <w:t>Séquence 2. Les 5 Pourquoi guidés, 09h00 à 09h45</w:t>
+        <w:t>Déroulé</w:t>
       </w:r>
     </w:p>
+    <w:tbl>
+      <w:tblPr>
+        <w:tblW w:type="auto" w:w="0"/>
+        <w:tblLook w:firstColumn="1" w:firstRow="1" w:lastColumn="0" w:lastRow="0" w:noHBand="0" w:noVBand="1" w:val="04A0"/>
+        <w:tblBorders>
+          <w:top w:val="single" w:sz="4" w:space="0" w:color="BFBFBF"/>
+          <w:left w:val="single" w:sz="4" w:space="0" w:color="BFBFBF"/>
+          <w:bottom w:val="single" w:sz="4" w:space="0" w:color="BFBFBF"/>
+          <w:right w:val="single" w:sz="4" w:space="0" w:color="BFBFBF"/>
+          <w:insideH w:val="single" w:sz="4" w:space="0" w:color="BFBFBF"/>
+          <w:insideV w:val="single" w:sz="4" w:space="0" w:color="BFBFBF"/>
+        </w:tblBorders>
+        <w:tblLayout w:type="fixed"/>
+      </w:tblPr>
+      <w:tblGrid>
+        <w:gridCol w:w="1134"/>
+        <w:gridCol w:w="1020"/>
+        <w:gridCol w:w="6917"/>
+      </w:tblGrid>
+      <w:tr>
+        <w:trPr>
+          <w:tblHeader w:val="true"/>
+          <w:cantSplit/>
+        </w:trPr>
+        <w:tc>
+          <w:tcPr>
+            <w:tcW w:type="dxa" w:w="1134"/>
+            <w:shd w:val="clear" w:color="auto" w:fill="1F3864"/>
+          </w:tcPr>
+          <w:p>
+            <w:pPr>
+              <w:spacing w:after="40"/>
+            </w:pPr>
+            <w:r>
+              <w:rPr>
+                <w:b/>
+                <w:color w:val="FFFFFF"/>
+                <w:sz w:val="20"/>
+              </w:rPr>
+              <w:t>Heure</w:t>
+            </w:r>
+          </w:p>
+        </w:tc>
+        <w:tc>
+          <w:tcPr>
+            <w:tcW w:type="dxa" w:w="1020"/>
+            <w:shd w:val="clear" w:color="auto" w:fill="1F3864"/>
+          </w:tcPr>
+          <w:p>
+            <w:pPr>
+              <w:spacing w:after="40"/>
+            </w:pPr>
+            <w:r>
+              <w:rPr>
+                <w:b/>
+                <w:color w:val="FFFFFF"/>
+                <w:sz w:val="20"/>
+              </w:rPr>
+              <w:t>Durée</w:t>
+            </w:r>
+          </w:p>
+        </w:tc>
+        <w:tc>
+          <w:tcPr>
+            <w:tcW w:type="dxa" w:w="6917"/>
+            <w:shd w:val="clear" w:color="auto" w:fill="1F3864"/>
+          </w:tcPr>
+          <w:p>
+            <w:pPr>
+              <w:spacing w:after="40"/>
+            </w:pPr>
+            <w:r>
+              <w:rPr>
+                <w:b/>
+                <w:color w:val="FFFFFF"/>
+                <w:sz w:val="20"/>
+              </w:rPr>
+              <w:t>Ce qui se passe</w:t>
+            </w:r>
+          </w:p>
+        </w:tc>
+      </w:tr>
+      <w:tr>
+        <w:trPr>
+          <w:cantSplit/>
+        </w:trPr>
+        <w:tc>
+          <w:tcPr>
+            <w:tcW w:type="dxa" w:w="1134"/>
+            <w:shd w:val="clear" w:color="auto" w:fill="FFFFFF"/>
+          </w:tcPr>
+          <w:p>
+            <w:pPr>
+              <w:spacing w:after="40"/>
+            </w:pPr>
+            <w:r>
+              <w:rPr>
+                <w:b w:val="0"/>
+                <w:sz w:val="20"/>
+              </w:rPr>
+              <w:t>08h30</w:t>
+            </w:r>
+          </w:p>
+        </w:tc>
+        <w:tc>
+          <w:tcPr>
+            <w:tcW w:type="dxa" w:w="1020"/>
+            <w:shd w:val="clear" w:color="auto" w:fill="FFFFFF"/>
+          </w:tcPr>
+          <w:p>
+            <w:pPr>
+              <w:spacing w:after="40"/>
+            </w:pPr>
+            <w:r>
+              <w:rPr>
+                <w:b w:val="0"/>
+                <w:sz w:val="20"/>
+              </w:rPr>
+              <w:t>5 min</w:t>
+            </w:r>
+          </w:p>
+        </w:tc>
+        <w:tc>
+          <w:tcPr>
+            <w:tcW w:type="dxa" w:w="6917"/>
+            <w:shd w:val="clear" w:color="auto" w:fill="FFFFFF"/>
+          </w:tcPr>
+          <w:p>
+            <w:pPr>
+              <w:spacing w:after="40"/>
+            </w:pPr>
+            <w:r>
+              <w:rPr>
+                <w:b w:val="0"/>
+                <w:sz w:val="20"/>
+              </w:rPr>
+              <w:t>Tour de table court. Une phrase chacun sur ce qu'ils ont fait en entreprise depuis la dernière fois. Tu ne commentes pas, tu écoutes.</w:t>
+            </w:r>
+          </w:p>
+        </w:tc>
+      </w:tr>
+      <w:tr>
+        <w:trPr>
+          <w:cantSplit/>
+        </w:trPr>
+        <w:tc>
+          <w:tcPr>
+            <w:tcW w:type="dxa" w:w="1134"/>
+            <w:shd w:val="clear" w:color="auto" w:fill="F5F5F5"/>
+          </w:tcPr>
+          <w:p>
+            <w:pPr>
+              <w:spacing w:after="40"/>
+            </w:pPr>
+            <w:r>
+              <w:rPr>
+                <w:b w:val="0"/>
+                <w:sz w:val="20"/>
+              </w:rPr>
+              <w:t>08h35</w:t>
+            </w:r>
+          </w:p>
+        </w:tc>
+        <w:tc>
+          <w:tcPr>
+            <w:tcW w:type="dxa" w:w="1020"/>
+            <w:shd w:val="clear" w:color="auto" w:fill="F5F5F5"/>
+          </w:tcPr>
+          <w:p>
+            <w:pPr>
+              <w:spacing w:after="40"/>
+            </w:pPr>
+            <w:r>
+              <w:rPr>
+                <w:b w:val="0"/>
+                <w:sz w:val="20"/>
+              </w:rPr>
+              <w:t>5 min</w:t>
+            </w:r>
+          </w:p>
+        </w:tc>
+        <w:tc>
+          <w:tcPr>
+            <w:tcW w:type="dxa" w:w="6917"/>
+            <w:shd w:val="clear" w:color="auto" w:fill="F5F5F5"/>
+          </w:tcPr>
+          <w:p>
+            <w:pPr>
+              <w:spacing w:after="40"/>
+            </w:pPr>
+            <w:r>
+              <w:rPr>
+                <w:b w:val="0"/>
+                <w:sz w:val="20"/>
+              </w:rPr>
+              <w:t>Tu remets la fiche A et tu poses la question de la journée : quand quelque chose ne va pas dans un atelier, comment on trouve pourquoi.</w:t>
+            </w:r>
+          </w:p>
+        </w:tc>
+      </w:tr>
+      <w:tr>
+        <w:trPr>
+          <w:cantSplit/>
+        </w:trPr>
+        <w:tc>
+          <w:tcPr>
+            <w:tcW w:type="dxa" w:w="1134"/>
+            <w:shd w:val="clear" w:color="auto" w:fill="FFFFFF"/>
+          </w:tcPr>
+          <w:p>
+            <w:pPr>
+              <w:spacing w:after="40"/>
+            </w:pPr>
+            <w:r>
+              <w:rPr>
+                <w:b w:val="0"/>
+                <w:sz w:val="20"/>
+              </w:rPr>
+              <w:t>08h40</w:t>
+            </w:r>
+          </w:p>
+        </w:tc>
+        <w:tc>
+          <w:tcPr>
+            <w:tcW w:type="dxa" w:w="1020"/>
+            <w:shd w:val="clear" w:color="auto" w:fill="FFFFFF"/>
+          </w:tcPr>
+          <w:p>
+            <w:pPr>
+              <w:spacing w:after="40"/>
+            </w:pPr>
+            <w:r>
+              <w:rPr>
+                <w:b w:val="0"/>
+                <w:sz w:val="20"/>
+              </w:rPr>
+              <w:t>10 min</w:t>
+            </w:r>
+          </w:p>
+        </w:tc>
+        <w:tc>
+          <w:tcPr>
+            <w:tcW w:type="dxa" w:w="6917"/>
+            <w:shd w:val="clear" w:color="auto" w:fill="FFFFFF"/>
+          </w:tcPr>
+          <w:p>
+            <w:pPr>
+              <w:spacing w:after="40"/>
+            </w:pPr>
+            <w:r>
+              <w:rPr>
+                <w:b w:val="0"/>
+                <w:sz w:val="20"/>
+              </w:rPr>
+              <w:t>Chacun écrit trois post-its, un dysfonctionnement par post-it. Silence. C'est individuel et anonyme.</w:t>
+            </w:r>
+          </w:p>
+        </w:tc>
+      </w:tr>
+      <w:tr>
+        <w:trPr>
+          <w:cantSplit/>
+        </w:trPr>
+        <w:tc>
+          <w:tcPr>
+            <w:tcW w:type="dxa" w:w="1134"/>
+            <w:shd w:val="clear" w:color="auto" w:fill="F5F5F5"/>
+          </w:tcPr>
+          <w:p>
+            <w:pPr>
+              <w:spacing w:after="40"/>
+            </w:pPr>
+            <w:r>
+              <w:rPr>
+                <w:b w:val="0"/>
+                <w:sz w:val="20"/>
+              </w:rPr>
+              <w:t>08h50</w:t>
+            </w:r>
+          </w:p>
+        </w:tc>
+        <w:tc>
+          <w:tcPr>
+            <w:tcW w:type="dxa" w:w="1020"/>
+            <w:shd w:val="clear" w:color="auto" w:fill="F5F5F5"/>
+          </w:tcPr>
+          <w:p>
+            <w:pPr>
+              <w:spacing w:after="40"/>
+            </w:pPr>
+            <w:r>
+              <w:rPr>
+                <w:b w:val="0"/>
+                <w:sz w:val="20"/>
+              </w:rPr>
+              <w:t>8 min</w:t>
+            </w:r>
+          </w:p>
+        </w:tc>
+        <w:tc>
+          <w:tcPr>
+            <w:tcW w:type="dxa" w:w="6917"/>
+            <w:shd w:val="clear" w:color="auto" w:fill="F5F5F5"/>
+          </w:tcPr>
+          <w:p>
+            <w:pPr>
+              <w:spacing w:after="40"/>
+            </w:pPr>
+            <w:r>
+              <w:rPr>
+                <w:b w:val="0"/>
+                <w:sz w:val="20"/>
+              </w:rPr>
+              <w:t>Tout au tableau. Regroupement par famille, fait par le groupe debout, pas par toi.</w:t>
+            </w:r>
+          </w:p>
+        </w:tc>
+      </w:tr>
+      <w:tr>
+        <w:trPr>
+          <w:cantSplit/>
+        </w:trPr>
+        <w:tc>
+          <w:tcPr>
+            <w:tcW w:type="dxa" w:w="1134"/>
+            <w:shd w:val="clear" w:color="auto" w:fill="FFFFFF"/>
+          </w:tcPr>
+          <w:p>
+            <w:pPr>
+              <w:spacing w:after="40"/>
+            </w:pPr>
+            <w:r>
+              <w:rPr>
+                <w:b w:val="0"/>
+                <w:sz w:val="20"/>
+              </w:rPr>
+              <w:t>08h58</w:t>
+            </w:r>
+          </w:p>
+        </w:tc>
+        <w:tc>
+          <w:tcPr>
+            <w:tcW w:type="dxa" w:w="1020"/>
+            <w:shd w:val="clear" w:color="auto" w:fill="FFFFFF"/>
+          </w:tcPr>
+          <w:p>
+            <w:pPr>
+              <w:spacing w:after="40"/>
+            </w:pPr>
+            <w:r>
+              <w:rPr>
+                <w:b w:val="0"/>
+                <w:sz w:val="20"/>
+              </w:rPr>
+              <w:t>2 min</w:t>
+            </w:r>
+          </w:p>
+        </w:tc>
+        <w:tc>
+          <w:tcPr>
+            <w:tcW w:type="dxa" w:w="6917"/>
+            <w:shd w:val="clear" w:color="auto" w:fill="FFFFFF"/>
+          </w:tcPr>
+          <w:p>
+            <w:pPr>
+              <w:spacing w:after="40"/>
+            </w:pPr>
+            <w:r>
+              <w:rPr>
+                <w:b w:val="0"/>
+                <w:sz w:val="20"/>
+              </w:rPr>
+              <w:t>Tu laisses les post-its affichés jusqu'à 13h30. Tu ramasses la fiche A.</w:t>
+            </w:r>
+          </w:p>
+        </w:tc>
+      </w:tr>
+    </w:tbl>
     <w:p>
       <w:pPr>
         <w:spacing w:after="120"/>
       </w:pPr>
-      <w:r>
-        <w:rPr>
-          <w:b w:val="0"/>
-          <w:i w:val="0"/>
-        </w:rPr>
-        <w:t>Démonstration collective au tableau blanc. Tu écris, ils parlent. Aucun support papier.</w:t>
-      </w:r>
     </w:p>
     <w:tbl>
       <w:tblPr>
@@ -2270,19 +2441,26 @@
                 <w:color w:val="B45F06"/>
                 <w:sz w:val="21"/>
               </w:rPr>
-              <w:t>La règle que tu poses avant de commencer</w:t>
-            </w:r>
-          </w:p>
-          <w:p>
-            <w:pPr>
-              <w:spacing w:after="40"/>
-            </w:pPr>
-            <w:r>
-              <w:rPr>
-                <w:b w:val="0"/>
+              <w:t>Les deux choses à tenir</w:t>
+            </w:r>
+          </w:p>
+          <w:p>
+            <w:pPr>
+              <w:spacing w:after="40"/>
+            </w:pPr>
+            <w:r>
+              <w:rPr>
+                <w:b/>
                 <w:sz w:val="21"/>
               </w:rPr>
-              <w:t>Chaque « pourquoi » porte sur le procédé, la machine ou l'organisation.</w:t>
+              <w:t xml:space="preserve">Ne laisse personne écrire un nom de personne sur un post-it. </w:t>
+            </w:r>
+            <w:r>
+              <w:rPr>
+                <w:b w:val="0"/>
+                <w:sz w:val="21"/>
+              </w:rPr>
+              <w:t>Si ça arrive, tu reformules devant tout le monde : le problème n'est pas la personne, c'est ce qui a permis la situation.</w:t>
             </w:r>
           </w:p>
           <w:p>
@@ -2291,10 +2469,310 @@
             </w:pPr>
             <w:r>
               <w:rPr>
-                <w:b w:val="0"/>
+                <w:b/>
                 <w:sz w:val="21"/>
               </w:rPr>
+              <w:t xml:space="preserve">Exige un chiffre, une fréquence ou une date sur chaque post-it. </w:t>
+            </w:r>
+            <w:r>
+              <w:rPr>
+                <w:b w:val="0"/>
+                <w:sz w:val="21"/>
+              </w:rPr>
+              <w:t>Un post-it sans repère chiffré ne tiendra pas une heure de travail cet après-midi. Renvoie-le à son auteur pour qu'il le complète.</w:t>
+            </w:r>
+          </w:p>
+        </w:tc>
+      </w:tr>
+    </w:tbl>
+    <w:p>
+      <w:pPr>
+        <w:spacing w:after="120"/>
+      </w:pPr>
+    </w:p>
+    <w:tbl>
+      <w:tblPr>
+        <w:tblW w:type="auto" w:w="0"/>
+        <w:tblLook w:firstColumn="1" w:firstRow="1" w:lastColumn="0" w:lastRow="0" w:noHBand="0" w:noVBand="1" w:val="04A0"/>
+        <w:tblBorders>
+          <w:top w:val="single" w:sz="2" w:space="0" w:color="38761D"/>
+          <w:left w:val="single" w:sz="18" w:space="0" w:color="38761D"/>
+          <w:bottom w:val="single" w:sz="2" w:space="0" w:color="38761D"/>
+          <w:right w:val="single" w:sz="2" w:space="0" w:color="38761D"/>
+          <w:insideH w:val="none" w:sz="0" w:space="0" w:color="FFFFFF"/>
+          <w:insideV w:val="none" w:sz="0" w:space="0" w:color="FFFFFF"/>
+        </w:tblBorders>
+      </w:tblPr>
+      <w:tblGrid>
+        <w:gridCol w:w="9706"/>
+      </w:tblGrid>
+      <w:tr>
+        <w:tc>
+          <w:tcPr>
+            <w:tcW w:type="dxa" w:w="9706"/>
+            <w:shd w:val="clear" w:color="auto" w:fill="EAF3EA"/>
+            <w:tcMar>
+              <w:top w:w="140" w:type="dxa"/>
+              <w:left w:w="180" w:type="dxa"/>
+              <w:bottom w:w="140" w:type="dxa"/>
+              <w:right w:w="180" w:type="dxa"/>
+            </w:tcMar>
+          </w:tcPr>
+          <w:p>
+            <w:pPr>
+              <w:spacing w:after="80"/>
+            </w:pPr>
+            <w:r>
+              <w:rPr>
+                <w:b/>
+                <w:color w:val="38761D"/>
+                <w:sz w:val="21"/>
+              </w:rPr>
+              <w:t>Si le groupe ne produit rien</w:t>
+            </w:r>
+          </w:p>
+          <w:p>
+            <w:pPr>
+              <w:spacing w:after="40"/>
+            </w:pPr>
+            <w:r>
+              <w:rPr>
+                <w:b w:val="0"/>
+                <w:sz w:val="21"/>
+              </w:rPr>
+              <w:t>C'est possible avec un public qui n'ose pas. Amorce toi-même avec deux exemples neutres écrits au tableau : « vingt minutes par jour à chercher un outil de serrage », « trois pièces reprises sur dix au pointage ».</w:t>
+            </w:r>
+          </w:p>
+          <w:p>
+            <w:pPr>
+              <w:spacing w:after="0"/>
+            </w:pPr>
+            <w:r>
+              <w:rPr>
+                <w:b w:val="0"/>
+                <w:sz w:val="21"/>
+              </w:rPr>
+              <w:t>Ne donne pas d'exemple tiré de leur entreprise, même si tu la connais.</w:t>
+            </w:r>
+          </w:p>
+        </w:tc>
+      </w:tr>
+    </w:tbl>
+    <w:p>
+      <w:pPr>
+        <w:spacing w:after="120"/>
+      </w:pPr>
+    </w:p>
+    <w:p>
+      <w:pPr>
+        <w:pStyle w:val="Titre1"/>
+      </w:pPr>
+      <w:r>
+        <w:rPr>
+          <w:b w:val="0"/>
+          <w:i w:val="0"/>
+        </w:rPr>
+        <w:t>Séquence B. Les 5 Pourquoi guidés, 09h00 à 09h45</w:t>
+      </w:r>
+    </w:p>
+    <w:p>
+      <w:pPr>
+        <w:spacing w:after="120"/>
+      </w:pPr>
+      <w:r>
+        <w:rPr>
+          <w:b w:val="0"/>
+          <w:i w:val="0"/>
+        </w:rPr>
+        <w:t>Démonstration collective au tableau blanc. Tu écris, ils parlent.</w:t>
+      </w:r>
+    </w:p>
+    <w:tbl>
+      <w:tblPr>
+        <w:tblW w:type="auto" w:w="0"/>
+        <w:tblLook w:firstColumn="1" w:firstRow="1" w:lastColumn="0" w:lastRow="0" w:noHBand="0" w:noVBand="1" w:val="04A0"/>
+        <w:tblBorders>
+          <w:top w:val="single" w:sz="2" w:space="0" w:color="2E5A9C"/>
+          <w:left w:val="single" w:sz="18" w:space="0" w:color="2E5A9C"/>
+          <w:bottom w:val="single" w:sz="2" w:space="0" w:color="2E5A9C"/>
+          <w:right w:val="single" w:sz="2" w:space="0" w:color="2E5A9C"/>
+          <w:insideH w:val="none" w:sz="0" w:space="0" w:color="FFFFFF"/>
+          <w:insideV w:val="none" w:sz="0" w:space="0" w:color="FFFFFF"/>
+        </w:tblBorders>
+      </w:tblPr>
+      <w:tblGrid>
+        <w:gridCol w:w="9706"/>
+      </w:tblGrid>
+      <w:tr>
+        <w:tc>
+          <w:tcPr>
+            <w:tcW w:type="dxa" w:w="9706"/>
+            <w:shd w:val="clear" w:color="auto" w:fill="EDF1F8"/>
+            <w:tcMar>
+              <w:top w:w="140" w:type="dxa"/>
+              <w:left w:w="180" w:type="dxa"/>
+              <w:bottom w:w="140" w:type="dxa"/>
+              <w:right w:w="180" w:type="dxa"/>
+            </w:tcMar>
+          </w:tcPr>
+          <w:p>
+            <w:pPr>
+              <w:spacing w:after="80"/>
+            </w:pPr>
+            <w:r>
+              <w:rPr>
+                <w:b/>
+                <w:color w:val="2E5A9C"/>
+                <w:sz w:val="21"/>
+              </w:rPr>
+              <w:t>Ce qu'ils ont en main</w:t>
+            </w:r>
+          </w:p>
+          <w:p>
+            <w:pPr>
+              <w:spacing w:after="40"/>
+            </w:pPr>
+            <w:r>
+              <w:rPr>
+                <w:b w:val="0"/>
+                <w:sz w:val="21"/>
+              </w:rPr>
+              <w:t>Les fiches B, pages 3 et 4 des pochettes apprenant, remises à 09h00.</w:t>
+            </w:r>
+          </w:p>
+          <w:p>
+            <w:pPr>
+              <w:spacing w:after="40"/>
+            </w:pPr>
+            <w:r>
+              <w:rPr>
+                <w:b w:val="0"/>
+                <w:sz w:val="21"/>
+              </w:rPr>
+              <w:t>Page 3 : la mise en situation et les cinq faits établis. Ils la lisent seuls, trois minutes, avant qu'on commence.</w:t>
+            </w:r>
+          </w:p>
+          <w:p>
+            <w:pPr>
+              <w:spacing w:after="40"/>
+            </w:pPr>
+            <w:r>
+              <w:rPr>
+                <w:b w:val="0"/>
+                <w:sz w:val="21"/>
+              </w:rPr>
+              <w:t>Page 4 : la grille de descente, qu'ils remplissent en même temps que le tableau.</w:t>
+            </w:r>
+          </w:p>
+          <w:p>
+            <w:pPr>
+              <w:spacing w:after="0"/>
+            </w:pPr>
+            <w:r>
+              <w:rPr>
+                <w:b w:val="0"/>
+                <w:sz w:val="21"/>
+              </w:rPr>
+              <w:t>Cette séquence ne suppose rien de ce qui précède. Elle est utilisable seule.</w:t>
+            </w:r>
+          </w:p>
+        </w:tc>
+      </w:tr>
+    </w:tbl>
+    <w:p>
+      <w:pPr>
+        <w:spacing w:after="120"/>
+      </w:pPr>
+    </w:p>
+    <w:tbl>
+      <w:tblPr>
+        <w:tblW w:type="auto" w:w="0"/>
+        <w:tblLook w:firstColumn="1" w:firstRow="1" w:lastColumn="0" w:lastRow="0" w:noHBand="0" w:noVBand="1" w:val="04A0"/>
+        <w:tblBorders>
+          <w:top w:val="single" w:sz="2" w:space="0" w:color="B45F06"/>
+          <w:left w:val="single" w:sz="18" w:space="0" w:color="B45F06"/>
+          <w:bottom w:val="single" w:sz="2" w:space="0" w:color="B45F06"/>
+          <w:right w:val="single" w:sz="2" w:space="0" w:color="B45F06"/>
+          <w:insideH w:val="none" w:sz="0" w:space="0" w:color="FFFFFF"/>
+          <w:insideV w:val="none" w:sz="0" w:space="0" w:color="FFFFFF"/>
+        </w:tblBorders>
+      </w:tblPr>
+      <w:tblGrid>
+        <w:gridCol w:w="9706"/>
+      </w:tblGrid>
+      <w:tr>
+        <w:tc>
+          <w:tcPr>
+            <w:tcW w:type="dxa" w:w="9706"/>
+            <w:shd w:val="clear" w:color="auto" w:fill="FDF2E9"/>
+            <w:tcMar>
+              <w:top w:w="140" w:type="dxa"/>
+              <w:left w:w="180" w:type="dxa"/>
+              <w:bottom w:w="140" w:type="dxa"/>
+              <w:right w:w="180" w:type="dxa"/>
+            </w:tcMar>
+          </w:tcPr>
+          <w:p>
+            <w:pPr>
+              <w:spacing w:after="80"/>
+            </w:pPr>
+            <w:r>
+              <w:rPr>
+                <w:b/>
+                <w:color w:val="B45F06"/>
+                <w:sz w:val="21"/>
+              </w:rPr>
+              <w:t>Les deux règles que tu poses avant de commencer</w:t>
+            </w:r>
+          </w:p>
+          <w:p>
+            <w:pPr>
+              <w:spacing w:after="40"/>
+            </w:pPr>
+            <w:r>
+              <w:rPr>
+                <w:b/>
+                <w:sz w:val="21"/>
+              </w:rPr>
+              <w:t xml:space="preserve">1. Chaque « pourquoi » porte sur le procédé, la machine ou l'organisation. </w:t>
+            </w:r>
+            <w:r>
+              <w:rPr>
+                <w:b w:val="0"/>
+                <w:sz w:val="21"/>
+              </w:rPr>
               <w:t>Aucun ne porte sur une personne. Si quelqu'un répond « parce que le technicien a oublié », tu reformules : « pourquoi le système permettait-il l'oubli ? »</w:t>
+            </w:r>
+          </w:p>
+          <w:p>
+            <w:pPr>
+              <w:spacing w:after="40"/>
+            </w:pPr>
+            <w:r>
+              <w:rPr>
+                <w:b/>
+                <w:sz w:val="21"/>
+              </w:rPr>
+              <w:t xml:space="preserve">2. À chaque niveau, ils doivent te demander : comment on le sait ? </w:t>
+            </w:r>
+            <w:r>
+              <w:rPr>
+                <w:b w:val="0"/>
+                <w:sz w:val="21"/>
+              </w:rPr>
+              <w:t>Tu ne donnes l'information qu'à ce moment-là. Une réponse sans preuve reste au tableau entre parenthèses, comme une supposition à vérifier.</w:t>
+            </w:r>
+          </w:p>
+          <w:p>
+            <w:pPr>
+              <w:spacing w:after="0"/>
+            </w:pPr>
+            <w:r>
+              <w:rPr>
+                <w:b w:val="0"/>
+                <w:sz w:val="21"/>
+              </w:rPr>
+              <w:t>La colonne « sur quel fait on s'appuie » de leur grille sert à ça. Si elle reste vide sur une ligne, c'est que le groupe a deviné.</w:t>
             </w:r>
           </w:p>
         </w:tc>
@@ -2865,7 +3343,7 @@
           <w:b w:val="0"/>
           <w:i w:val="0"/>
         </w:rPr>
-        <w:t>Séquence 3. L'enquête industrielle, 10h00 à 12h30</w:t>
+        <w:t>Séquence C. L'enquête industrielle, 10h00 à 12h30</w:t>
       </w:r>
     </w:p>
     <w:p>
@@ -3106,6 +3584,19 @@
       </w:pPr>
       <w:r>
         <w:t>Un dossier de départ par cellule : pièces P1 à P4, la demande d'indice, le vocabulaire.</w:t>
+      </w:r>
+    </w:p>
+    <w:p>
+      <w:pPr>
+        <w:pStyle w:val="Paragraphedeliste"/>
+        <w:spacing w:after="80"/>
+        <w:numPr>
+          <w:ilvl w:val="0"/>
+          <w:numId w:val="2"/>
+        </w:numPr>
+      </w:pPr>
+      <w:r>
+        <w:t>Un poster Ishikawa 5M vierge par cellule, format A3, à afficher au mur.</w:t>
       </w:r>
     </w:p>
     <w:p>
@@ -7330,7 +7821,7 @@
                 <w:color w:val="38761D"/>
                 <w:sz w:val="21"/>
               </w:rPr>
-              <w:t>Le pont avec le matin</w:t>
+              <w:t>Le mot de la fin sur cette affaire</w:t>
             </w:r>
           </w:p>
           <w:p>
@@ -7342,7 +7833,7 @@
                 <w:b w:val="0"/>
                 <w:sz w:val="21"/>
               </w:rPr>
-              <w:t>L'action préventive est un détrompeur : un flan non marqué ne peut pas passer au poste suivant. C'est exactement ce qu'ils ont manipulé à 8h30.</w:t>
+              <w:t>L'action préventive est un détrompeur : un flan non marqué ne peut pas passer au poste suivant. Le magasinier n'a plus à se souvenir de rien, le système ne le laisse plus se tromper.</w:t>
             </w:r>
           </w:p>
           <w:p>
@@ -7354,7 +7845,7 @@
                 <w:b w:val="0"/>
                 <w:sz w:val="21"/>
               </w:rPr>
-              <w:t>Fais le rapprochement à voix haute. C'est ce qui donne son unité à la journée.</w:t>
+              <w:t>Fais-leur dire la différence avec « il faudra faire attention à la réception ».</w:t>
             </w:r>
           </w:p>
         </w:tc>
@@ -8175,7 +8666,7 @@
           <w:b w:val="0"/>
           <w:i w:val="0"/>
         </w:rPr>
-        <w:t>Séquence 4. Recueil des problèmes de stage, 13h30 à 13h50</w:t>
+        <w:t>Séquence D. Le choix des trois cas, 13h30 à 13h45</w:t>
       </w:r>
     </w:p>
     <w:p>
@@ -8187,8 +8678,81 @@
           <w:b w:val="0"/>
           <w:i w:val="0"/>
         </w:rPr>
-        <w:t>Tu passes d'une affaire dont tu connais la réponse à des situations dont personne ne la connaît. Dis-le au groupe, c'est le moment où ils prennent la main.</w:t>
+        <w:t>Les post-its sont au tableau depuis ce matin. Il ne reste qu'à choisir. Quinze minutes suffisent.</w:t>
       </w:r>
+    </w:p>
+    <w:tbl>
+      <w:tblPr>
+        <w:tblW w:type="auto" w:w="0"/>
+        <w:tblLook w:firstColumn="1" w:firstRow="1" w:lastColumn="0" w:lastRow="0" w:noHBand="0" w:noVBand="1" w:val="04A0"/>
+        <w:tblBorders>
+          <w:top w:val="single" w:sz="2" w:space="0" w:color="2E5A9C"/>
+          <w:left w:val="single" w:sz="18" w:space="0" w:color="2E5A9C"/>
+          <w:bottom w:val="single" w:sz="2" w:space="0" w:color="2E5A9C"/>
+          <w:right w:val="single" w:sz="2" w:space="0" w:color="2E5A9C"/>
+          <w:insideH w:val="none" w:sz="0" w:space="0" w:color="FFFFFF"/>
+          <w:insideV w:val="none" w:sz="0" w:space="0" w:color="FFFFFF"/>
+        </w:tblBorders>
+      </w:tblPr>
+      <w:tblGrid>
+        <w:gridCol w:w="9706"/>
+      </w:tblGrid>
+      <w:tr>
+        <w:tc>
+          <w:tcPr>
+            <w:tcW w:type="dxa" w:w="9706"/>
+            <w:shd w:val="clear" w:color="auto" w:fill="EDF1F8"/>
+            <w:tcMar>
+              <w:top w:w="140" w:type="dxa"/>
+              <w:left w:w="180" w:type="dxa"/>
+              <w:bottom w:w="140" w:type="dxa"/>
+              <w:right w:w="180" w:type="dxa"/>
+            </w:tcMar>
+          </w:tcPr>
+          <w:p>
+            <w:pPr>
+              <w:spacing w:after="80"/>
+            </w:pPr>
+            <w:r>
+              <w:rPr>
+                <w:b/>
+                <w:color w:val="2E5A9C"/>
+                <w:sz w:val="21"/>
+              </w:rPr>
+              <w:t>Ce qu'ils ont en main</w:t>
+            </w:r>
+          </w:p>
+          <w:p>
+            <w:pPr>
+              <w:spacing w:after="40"/>
+            </w:pPr>
+            <w:r>
+              <w:rPr>
+                <w:b w:val="0"/>
+                <w:sz w:val="21"/>
+              </w:rPr>
+              <w:t>La fiche D, page 5 des pochettes, remise à 13h30 et ramassée à 13h45.</w:t>
+            </w:r>
+          </w:p>
+          <w:p>
+            <w:pPr>
+              <w:spacing w:after="0"/>
+            </w:pPr>
+            <w:r>
+              <w:rPr>
+                <w:b w:val="0"/>
+                <w:sz w:val="21"/>
+              </w:rPr>
+              <w:t>Elle porte les quatre critères qui font qu'un cas est traitable. Fais-la lire avant le vote, sinon ils votent au sentiment.</w:t>
+            </w:r>
+          </w:p>
+        </w:tc>
+      </w:tr>
+    </w:tbl>
+    <w:p>
+      <w:pPr>
+        <w:spacing w:after="120"/>
+      </w:pPr>
     </w:p>
     <w:p>
       <w:pPr>
@@ -8196,11 +8760,11 @@
         <w:spacing w:after="80"/>
         <w:numPr>
           <w:ilvl w:val="0"/>
-          <w:numId w:val="5"/>
+          <w:numId w:val="3"/>
         </w:numPr>
       </w:pPr>
       <w:r>
-        <w:t>Chacun reçoit trois post-its et écrit trois dysfonctionnements vus en stage. Un par post-it. Anonyme.</w:t>
+        <w:t>Regroupement des post-its par famille, fait par le groupe debout. Cinq minutes.</w:t>
       </w:r>
     </w:p>
     <w:p>
@@ -8209,11 +8773,11 @@
         <w:spacing w:after="80"/>
         <w:numPr>
           <w:ilvl w:val="0"/>
-          <w:numId w:val="5"/>
+          <w:numId w:val="3"/>
         </w:numPr>
       </w:pPr>
       <w:r>
-        <w:t>Trois axes annoncés : une perte de temps, un rebut récurrent, une panne répétitive.</w:t>
+        <w:t>Trois gommettes par personne. Vote silencieux, tout le monde en même temps.</w:t>
       </w:r>
     </w:p>
     <w:p>
@@ -8222,11 +8786,11 @@
         <w:spacing w:after="80"/>
         <w:numPr>
           <w:ilvl w:val="0"/>
-          <w:numId w:val="5"/>
+          <w:numId w:val="3"/>
         </w:numPr>
       </w:pPr>
       <w:r>
-        <w:t>Tout au tableau. Regroupement par affinité, fait par le groupe debout, pas par toi.</w:t>
+        <w:t>Dépouillement à voix haute. Les trois cas les plus votés sont retenus.</w:t>
       </w:r>
     </w:p>
     <w:p>
@@ -8235,11 +8799,11 @@
         <w:spacing w:after="80"/>
         <w:numPr>
           <w:ilvl w:val="0"/>
-          <w:numId w:val="5"/>
+          <w:numId w:val="3"/>
         </w:numPr>
       </w:pPr>
       <w:r>
-        <w:t>Trois gommettes par personne. Vote. Les trois cas les plus votés sont retenus.</w:t>
+        <w:t>Celui qui a apporté un cas retenu rejoint la cellule qui le traitera.</w:t>
       </w:r>
     </w:p>
     <w:tbl>
@@ -8324,8 +8888,81 @@
           <w:b w:val="0"/>
           <w:i w:val="0"/>
         </w:rPr>
-        <w:t>Séquence 5. Le co-développement, 13h50 à 14h50</w:t>
+        <w:t>Séquence E. Le co-développement, 13h45 à 14h50</w:t>
       </w:r>
+    </w:p>
+    <w:tbl>
+      <w:tblPr>
+        <w:tblW w:type="auto" w:w="0"/>
+        <w:tblLook w:firstColumn="1" w:firstRow="1" w:lastColumn="0" w:lastRow="0" w:noHBand="0" w:noVBand="1" w:val="04A0"/>
+        <w:tblBorders>
+          <w:top w:val="single" w:sz="2" w:space="0" w:color="2E5A9C"/>
+          <w:left w:val="single" w:sz="18" w:space="0" w:color="2E5A9C"/>
+          <w:bottom w:val="single" w:sz="2" w:space="0" w:color="2E5A9C"/>
+          <w:right w:val="single" w:sz="2" w:space="0" w:color="2E5A9C"/>
+          <w:insideH w:val="none" w:sz="0" w:space="0" w:color="FFFFFF"/>
+          <w:insideV w:val="none" w:sz="0" w:space="0" w:color="FFFFFF"/>
+        </w:tblBorders>
+      </w:tblPr>
+      <w:tblGrid>
+        <w:gridCol w:w="9706"/>
+      </w:tblGrid>
+      <w:tr>
+        <w:tc>
+          <w:tcPr>
+            <w:tcW w:type="dxa" w:w="9706"/>
+            <w:shd w:val="clear" w:color="auto" w:fill="EDF1F8"/>
+            <w:tcMar>
+              <w:top w:w="140" w:type="dxa"/>
+              <w:left w:w="180" w:type="dxa"/>
+              <w:bottom w:w="140" w:type="dxa"/>
+              <w:right w:w="180" w:type="dxa"/>
+            </w:tcMar>
+          </w:tcPr>
+          <w:p>
+            <w:pPr>
+              <w:spacing w:after="80"/>
+            </w:pPr>
+            <w:r>
+              <w:rPr>
+                <w:b/>
+                <w:color w:val="2E5A9C"/>
+                <w:sz w:val="21"/>
+              </w:rPr>
+              <w:t>Ce qu'ils ont en main</w:t>
+            </w:r>
+          </w:p>
+          <w:p>
+            <w:pPr>
+              <w:spacing w:after="40"/>
+            </w:pPr>
+            <w:r>
+              <w:rPr>
+                <w:b w:val="0"/>
+                <w:sz w:val="21"/>
+              </w:rPr>
+              <w:t>La fiche E, page 6 des pochettes : les rôles, le déroulé en quatre temps et les quatre contrôles qu'ils font eux-mêmes.</w:t>
+            </w:r>
+          </w:p>
+          <w:p>
+            <w:pPr>
+              <w:spacing w:after="0"/>
+            </w:pPr>
+            <w:r>
+              <w:rPr>
+                <w:b w:val="0"/>
+                <w:sz w:val="21"/>
+              </w:rPr>
+              <w:t>Une trame A3 et un poster Ishikawa par cellule.</w:t>
+            </w:r>
+          </w:p>
+        </w:tc>
+      </w:tr>
+    </w:tbl>
+    <w:p>
+      <w:pPr>
+        <w:spacing w:after="120"/>
+      </w:pPr>
     </w:p>
     <w:tbl>
       <w:tblPr>
@@ -8659,7 +9296,7 @@
                 <w:b w:val="0"/>
                 <w:sz w:val="21"/>
               </w:rPr>
-              <w:t>C'est la même question que ce matin. Elle marche sur leurs cas comme sur l'affaire du lot.</w:t>
+              <w:t>Elle est sur leur fiche. Renvoie-les-y plutôt que de répondre à leur place.</w:t>
             </w:r>
           </w:p>
         </w:tc>
@@ -8679,7 +9316,7 @@
           <w:b w:val="0"/>
           <w:i w:val="0"/>
         </w:rPr>
-        <w:t>Séquence 6. Le rituel debout, 15h05 à 16h00</w:t>
+        <w:t>Séquence F. Le rituel debout, 15h05 à 16h00</w:t>
       </w:r>
     </w:p>
     <w:p>
@@ -8693,6 +9330,91 @@
         </w:rPr>
         <w:t>Tables écartées, tout le monde debout en cercle devant les affiches. Cinq minutes par cellule, chronométrées à la seconde.</w:t>
       </w:r>
+    </w:p>
+    <w:tbl>
+      <w:tblPr>
+        <w:tblW w:type="auto" w:w="0"/>
+        <w:tblLook w:firstColumn="1" w:firstRow="1" w:lastColumn="0" w:lastRow="0" w:noHBand="0" w:noVBand="1" w:val="04A0"/>
+        <w:tblBorders>
+          <w:top w:val="single" w:sz="2" w:space="0" w:color="2E5A9C"/>
+          <w:left w:val="single" w:sz="18" w:space="0" w:color="2E5A9C"/>
+          <w:bottom w:val="single" w:sz="2" w:space="0" w:color="2E5A9C"/>
+          <w:right w:val="single" w:sz="2" w:space="0" w:color="2E5A9C"/>
+          <w:insideH w:val="none" w:sz="0" w:space="0" w:color="FFFFFF"/>
+          <w:insideV w:val="none" w:sz="0" w:space="0" w:color="FFFFFF"/>
+        </w:tblBorders>
+      </w:tblPr>
+      <w:tblGrid>
+        <w:gridCol w:w="9706"/>
+      </w:tblGrid>
+      <w:tr>
+        <w:tc>
+          <w:tcPr>
+            <w:tcW w:type="dxa" w:w="9706"/>
+            <w:shd w:val="clear" w:color="auto" w:fill="EDF1F8"/>
+            <w:tcMar>
+              <w:top w:w="140" w:type="dxa"/>
+              <w:left w:w="180" w:type="dxa"/>
+              <w:bottom w:w="140" w:type="dxa"/>
+              <w:right w:w="180" w:type="dxa"/>
+            </w:tcMar>
+          </w:tcPr>
+          <w:p>
+            <w:pPr>
+              <w:spacing w:after="80"/>
+            </w:pPr>
+            <w:r>
+              <w:rPr>
+                <w:b/>
+                <w:color w:val="2E5A9C"/>
+                <w:sz w:val="21"/>
+              </w:rPr>
+              <w:t>Ce qu'ils ont en main</w:t>
+            </w:r>
+          </w:p>
+          <w:p>
+            <w:pPr>
+              <w:spacing w:after="40"/>
+            </w:pPr>
+            <w:r>
+              <w:rPr>
+                <w:b w:val="0"/>
+                <w:sz w:val="21"/>
+              </w:rPr>
+              <w:t>La fiche F, page 7 des pochettes, remise à 14h40, dix minutes avant la fin du co-développement. Ils préparent leur passage avec.</w:t>
+            </w:r>
+          </w:p>
+          <w:p>
+            <w:pPr>
+              <w:spacing w:after="40"/>
+            </w:pPr>
+            <w:r>
+              <w:rPr>
+                <w:b w:val="0"/>
+                <w:sz w:val="21"/>
+              </w:rPr>
+              <w:t>Elle donne le format imposé et les trois questions du comité, en clair. Les questions ne sont pas une surprise : le but est qu'ils y répondent bien, pas qu'ils se fassent piéger.</w:t>
+            </w:r>
+          </w:p>
+          <w:p>
+            <w:pPr>
+              <w:spacing w:after="0"/>
+            </w:pPr>
+            <w:r>
+              <w:rPr>
+                <w:b w:val="0"/>
+                <w:sz w:val="21"/>
+              </w:rPr>
+              <w:t>Une carte du comité par personne, distribuée à 15h05.</w:t>
+            </w:r>
+          </w:p>
+        </w:tc>
+      </w:tr>
+    </w:tbl>
+    <w:p>
+      <w:pPr>
+        <w:spacing w:after="120"/>
+      </w:pPr>
     </w:p>
     <w:tbl>
       <w:tblPr>
@@ -8906,7 +9628,7 @@
           <w:b w:val="0"/>
           <w:i w:val="0"/>
         </w:rPr>
-        <w:t>Les six autres stagiaires et toi jouez le comité. Trois questions imposées à la fin de chaque passage, une par membre du comité :</w:t>
+        <w:t>Les six autres stagiaires et toi jouez le comité. Trois questions imposées à la fin de chaque passage, une par membre du comité. Elles sont imprimées en cartes à découper, page 2 du fichier « 8_Fiche_memo_stagiaire.pdf », à distribuer avant de commencer :</w:t>
       </w:r>
     </w:p>
     <w:p>
@@ -9370,7 +10092,7 @@
           <w:b w:val="0"/>
           <w:i w:val="0"/>
         </w:rPr>
-        <w:t>Séquence 7. Débriefing, 16h00 à 16h30</w:t>
+        <w:t>Séquence G. Débriefing, 16h00 à 16h30</w:t>
       </w:r>
     </w:p>
     <w:tbl>
@@ -9479,7 +10201,31 @@
           <w:b w:val="0"/>
           <w:i w:val="0"/>
         </w:rPr>
-        <w:t>Tour de table de clôture, une phrase chacun : un moment de la journée qu'ils réutiliseront en entreprise. Note les réponses, elles te serviront pour le bilan.</w:t>
+        <w:t>Remets la fiche mémo, fichier « 8_Fiche_memo_stagiaire.pdf », page 1, un exemplaire par stagiaire. Elle reprend les sept réflexes de la journée et porte au bas une zone où chacun écrit le problème qu'il compte traiter dans son entreprise.</w:t>
+      </w:r>
+    </w:p>
+    <w:p>
+      <w:pPr>
+        <w:spacing w:after="120"/>
+      </w:pPr>
+      <w:r>
+        <w:rPr>
+          <w:b w:val="0"/>
+          <w:i w:val="0"/>
+        </w:rPr>
+        <w:t>Laisse-leur trois minutes pour remplir cette zone avant le tour de table. Une fiche remise sans être remplie ne ressort jamais de la poche.</w:t>
+      </w:r>
+    </w:p>
+    <w:p>
+      <w:pPr>
+        <w:spacing w:after="120"/>
+      </w:pPr>
+      <w:r>
+        <w:rPr>
+          <w:b w:val="0"/>
+          <w:i w:val="0"/>
+        </w:rPr>
+        <w:t>Tour de table de clôture, une phrase chacun : le problème qu'ils viennent d'écrire. Note les réponses, elles te serviront pour le bilan et pour la prochaine session.</w:t>
       </w:r>
     </w:p>
     <w:p>
@@ -9728,7 +10474,7 @@
                 <w:b w:val="0"/>
                 <w:sz w:val="20"/>
               </w:rPr>
-              <w:t>6 exemplaires, 3 pour l'enquête et 3 pour l'après-midi</w:t>
+              <w:t>Le fichier fait 2 pages, l'imprimer 3 fois en A3 paysage. 3 pour l'enquête du matin, 3 pour l'après-midi</w:t>
             </w:r>
           </w:p>
         </w:tc>
@@ -9768,7 +10514,7 @@
                 <w:b w:val="0"/>
                 <w:sz w:val="20"/>
               </w:rPr>
-              <w:t>Réunir le matériel du défi anti-erreur</w:t>
+              <w:t>Imprimer les posters Ishikawa</w:t>
             </w:r>
           </w:p>
         </w:tc>
@@ -9786,7 +10532,7 @@
                 <w:b w:val="0"/>
                 <w:sz w:val="20"/>
               </w:rPr>
-              <w:t>Équerres, visserie, tasseaux, boîtes, marqueur rouge</w:t>
+              <w:t>Le fichier fait 2 pages, l'imprimer 3 fois en A3 paysage</w:t>
             </w:r>
           </w:p>
         </w:tc>
@@ -9826,7 +10572,7 @@
                 <w:b w:val="0"/>
                 <w:sz w:val="20"/>
               </w:rPr>
-              <w:t>Préparer les kits de la manche 2</w:t>
+              <w:t>Imprimer les fiches mémo</w:t>
             </w:r>
           </w:p>
         </w:tc>
@@ -9844,7 +10590,7 @@
                 <w:b w:val="0"/>
                 <w:sz w:val="20"/>
               </w:rPr>
-              <w:t>Compartimentage et marquage rouge des vis longues</w:t>
+              <w:t>Page 1 en 9 exemplaires. Page 2, les cartes du comité, en 1 exemplaire à découper</w:t>
             </w:r>
           </w:p>
         </w:tc>
@@ -9884,7 +10630,7 @@
                 <w:b w:val="0"/>
                 <w:sz w:val="20"/>
               </w:rPr>
-              <w:t>Vérifier le matériel d'animation</w:t>
+              <w:t>Imprimer les pochettes apprenant</w:t>
             </w:r>
           </w:p>
         </w:tc>
@@ -9902,7 +10648,7 @@
                 <w:b w:val="0"/>
                 <w:sz w:val="20"/>
               </w:rPr>
-              <w:t>Paperboard, marqueurs, post-its 3 couleurs, gommettes, pâte adhésive, chronomètre</w:t>
+              <w:t>Pages 2 à 7, 9 exemplaires de chaque. Une chemise par séquence, dans l'ordre A, B, D, E, F</w:t>
             </w:r>
           </w:p>
         </w:tc>
@@ -9942,7 +10688,7 @@
                 <w:b w:val="0"/>
                 <w:sz w:val="20"/>
               </w:rPr>
-              <w:t>Repérer la salle</w:t>
+              <w:t>Vérifier le matériel d'animation</w:t>
             </w:r>
           </w:p>
         </w:tc>
@@ -9960,7 +10706,7 @@
                 <w:b w:val="0"/>
                 <w:sz w:val="20"/>
               </w:rPr>
-              <w:t>Un mur libre pour les affiches, des tables déplaçables</w:t>
+              <w:t>Paperboard, marqueurs, post-its 3 couleurs, gommettes, pâte adhésive, chronomètre</w:t>
             </w:r>
           </w:p>
         </w:tc>
@@ -10000,6 +10746,64 @@
                 <w:b w:val="0"/>
                 <w:sz w:val="20"/>
               </w:rPr>
+              <w:t>Repérer la salle</w:t>
+            </w:r>
+          </w:p>
+        </w:tc>
+        <w:tc>
+          <w:tcPr>
+            <w:tcW w:type="dxa" w:w="5329"/>
+            <w:shd w:val="clear" w:color="auto" w:fill="F5F5F5"/>
+          </w:tcPr>
+          <w:p>
+            <w:pPr>
+              <w:spacing w:after="40"/>
+            </w:pPr>
+            <w:r>
+              <w:rPr>
+                <w:b w:val="0"/>
+                <w:sz w:val="20"/>
+              </w:rPr>
+              <w:t>Un mur libre pour les affiches, des tables déplaçables</w:t>
+            </w:r>
+          </w:p>
+        </w:tc>
+        <w:tc>
+          <w:tcPr>
+            <w:tcW w:type="dxa" w:w="1134"/>
+            <w:shd w:val="clear" w:color="auto" w:fill="F5F5F5"/>
+          </w:tcPr>
+          <w:p>
+            <w:pPr>
+              <w:spacing w:after="40"/>
+            </w:pPr>
+            <w:r>
+              <w:rPr>
+                <w:b w:val="0"/>
+                <w:sz w:val="20"/>
+              </w:rPr>
+            </w:r>
+          </w:p>
+        </w:tc>
+      </w:tr>
+      <w:tr>
+        <w:trPr>
+          <w:cantSplit/>
+        </w:trPr>
+        <w:tc>
+          <w:tcPr>
+            <w:tcW w:type="dxa" w:w="2608"/>
+            <w:shd w:val="clear" w:color="auto" w:fill="FFFFFF"/>
+          </w:tcPr>
+          <w:p>
+            <w:pPr>
+              <w:spacing w:after="40"/>
+            </w:pPr>
+            <w:r>
+              <w:rPr>
+                <w:b w:val="0"/>
+                <w:sz w:val="20"/>
+              </w:rPr>
               <w:t>Relire le corrigé</w:t>
             </w:r>
           </w:p>
@@ -10007,7 +10811,7 @@
         <w:tc>
           <w:tcPr>
             <w:tcW w:type="dxa" w:w="5329"/>
-            <w:shd w:val="clear" w:color="auto" w:fill="F5F5F5"/>
+            <w:shd w:val="clear" w:color="auto" w:fill="FFFFFF"/>
           </w:tcPr>
           <w:p>
             <w:pPr>
@@ -10025,7 +10829,7 @@
         <w:tc>
           <w:tcPr>
             <w:tcW w:type="dxa" w:w="1134"/>
-            <w:shd w:val="clear" w:color="auto" w:fill="F5F5F5"/>
+            <w:shd w:val="clear" w:color="auto" w:fill="FFFFFF"/>
           </w:tcPr>
           <w:p>
             <w:pPr>
@@ -10133,6 +10937,79 @@
                 <w:sz w:val="21"/>
               </w:rPr>
               <w:t>Le reste est dans le dossier, tu peux le lire devant eux sans problème.</w:t>
+            </w:r>
+          </w:p>
+        </w:tc>
+      </w:tr>
+    </w:tbl>
+    <w:p>
+      <w:pPr>
+        <w:spacing w:after="120"/>
+      </w:pPr>
+    </w:p>
+    <w:tbl>
+      <w:tblPr>
+        <w:tblW w:type="auto" w:w="0"/>
+        <w:tblLook w:firstColumn="1" w:firstRow="1" w:lastColumn="0" w:lastRow="0" w:noHBand="0" w:noVBand="1" w:val="04A0"/>
+        <w:tblBorders>
+          <w:top w:val="single" w:sz="2" w:space="0" w:color="38761D"/>
+          <w:left w:val="single" w:sz="18" w:space="0" w:color="38761D"/>
+          <w:bottom w:val="single" w:sz="2" w:space="0" w:color="38761D"/>
+          <w:right w:val="single" w:sz="2" w:space="0" w:color="38761D"/>
+          <w:insideH w:val="none" w:sz="0" w:space="0" w:color="FFFFFF"/>
+          <w:insideV w:val="none" w:sz="0" w:space="0" w:color="FFFFFF"/>
+        </w:tblBorders>
+      </w:tblPr>
+      <w:tblGrid>
+        <w:gridCol w:w="9706"/>
+      </w:tblGrid>
+      <w:tr>
+        <w:tc>
+          <w:tcPr>
+            <w:tcW w:type="dxa" w:w="9706"/>
+            <w:shd w:val="clear" w:color="auto" w:fill="EAF3EA"/>
+            <w:tcMar>
+              <w:top w:w="140" w:type="dxa"/>
+              <w:left w:w="180" w:type="dxa"/>
+              <w:bottom w:w="140" w:type="dxa"/>
+              <w:right w:w="180" w:type="dxa"/>
+            </w:tcMar>
+          </w:tcPr>
+          <w:p>
+            <w:pPr>
+              <w:spacing w:after="80"/>
+            </w:pPr>
+            <w:r>
+              <w:rPr>
+                <w:b/>
+                <w:color w:val="38761D"/>
+                <w:sz w:val="21"/>
+              </w:rPr>
+              <w:t>Aucun matériel à fabriquer</w:t>
+            </w:r>
+          </w:p>
+          <w:p>
+            <w:pPr>
+              <w:spacing w:after="40"/>
+            </w:pPr>
+            <w:r>
+              <w:rPr>
+                <w:b w:val="0"/>
+                <w:sz w:val="21"/>
+              </w:rPr>
+              <w:t>Cette journée ne demande que de l'impression et de la papeterie courante : paperboard, marqueurs, post-its de trois couleurs, gommettes, pâte adhésive, un chronomètre.</w:t>
+            </w:r>
+          </w:p>
+          <w:p>
+            <w:pPr>
+              <w:spacing w:after="0"/>
+            </w:pPr>
+            <w:r>
+              <w:rPr>
+                <w:b w:val="0"/>
+                <w:sz w:val="21"/>
+              </w:rPr>
+              <w:t>Le défi anti-erreur, qui demandait une heure de préparation en atelier, a été retiré. Ses documents sont conservés dans le dossier des pistes écartées, au cas où tu voudrais le reprendre plus tard avec du temps devant toi.</w:t>
             </w:r>
           </w:p>
         </w:tc>

</xml_diff>